<commit_message>
fix(investor): §45b auf 131€ korrigiert + echtes AlltagsEngel-Logo im Pitch Deck
</commit_message>
<xml_diff>
--- a/investor/AlltagsEngel_Businessplan_2026.docx
+++ b/investor/AlltagsEngel_Businessplan_2026.docx
@@ -2041,7 +2041,7 @@
           <w:sz w:val="22"/>
           <w:szCs w:val="22"/>
         </w:rPr>
-        <w:t xml:space="preserve">Entlastungsbetrag §45b: 7,6 Mrd € pro Jahr — 60 % verfallen</w:t>
+        <w:t xml:space="preserve">Entlastungsbetrag §45b: 8,2 Mrd € pro Jahr — 60 % verfallen</w:t>
       </w:r>
     </w:p>
     <w:p>
@@ -2056,7 +2056,7 @@
           <w:sz w:val="22"/>
           <w:szCs w:val="22"/>
         </w:rPr>
-        <w:t xml:space="preserve">Jeder Pflegebedürftige mit Pflegegrad 1 bis 5 hat seit der Reform 2025 Anspruch auf 131 Euro pro Monat (zuvor 125 Euro) Entlastungsbetrag nach §45b SGB XI — für Alltagshilfe, Haushaltsunterstützung oder Betreuung. Das ergibt bundesweit ein Budget von 7,6 Milliarden Euro pro Jahr. Die Tragik: Laut einer Studie der Universität Bremen (2024) werden nur 38 Prozent dieses Budgets tatsächlich abgerufen. Der Rest — 4,7 Milliarden Euro — verfällt jährlich ungenutzt.</w:t>
+        <w:t xml:space="preserve">Jeder Pflegebedürftige mit Pflegegrad 1 bis 5 hat seit der Pflegereform 2025 Anspruch auf 131 Euro pro Monat Entlastungsbetrag nach §45b SGB XI — für Alltagshilfe, Haushaltsunterstützung oder Betreuung. Das ergibt bundesweit ein Budget von rund 8,2 Milliarden Euro pro Jahr. Die Tragik: Laut einer Studie der Universität Bremen (2024) werden nur 38 Prozent dieses Budgets tatsächlich abgerufen. Der Rest — über 5 Milliarden Euro — verfällt jährlich ungenutzt.</w:t>
       </w:r>
     </w:p>
     <w:p>

</xml_diff>

<commit_message>
fix(investor): Gründer-Name korrigiert auf Yusuf Ferhat Demir (alle 4 Deliverables)
</commit_message>
<xml_diff>
--- a/investor/AlltagsEngel_Businessplan_2026.docx
+++ b/investor/AlltagsEngel_Businessplan_2026.docx
@@ -132,7 +132,7 @@
           <w:sz w:val="20"/>
           <w:szCs w:val="20"/>
         </w:rPr>
-        <w:t xml:space="preserve">Verfasser: Yusuf Cilcioglu — Gründer &amp; CEO</w:t>
+        <w:t xml:space="preserve">Verfasser: Yusuf Ferhat Demir — Gründer &amp; CEO</w:t>
       </w:r>
     </w:p>
     <w:p>
@@ -873,7 +873,7 @@
           <w:sz w:val="22"/>
           <w:szCs w:val="22"/>
         </w:rPr>
-        <w:t xml:space="preserve">Das Unternehmen wird als Solo-Founder-Operation von Yusuf Cilcioglu geführt — Frankfurter mit türkisch-deutschen Wurzeln, Full-Stack-Entwickler (iOS, Android, Next.js, Supabase) und Product-Led-Founder. Die App wurde in vier Monaten von der Idee zum Live-Produkt entwickelt. Mit dem Pre-Seed werden die ersten vier Schlüssel-Hires gesetzt: Head of Operations, zwei Care-Manager, ein Growth Marketer und ein Partner-Manager.</w:t>
+        <w:t xml:space="preserve">Das Unternehmen wird als Solo-Founder-Operation von Yusuf Ferhat Demir geführt — Frankfurter mit türkisch-deutschen Wurzeln, Full-Stack-Entwickler (iOS, Android, Next.js, Supabase) und Product-Led-Founder. Die App wurde in vier Monaten von der Idee zum Live-Produkt entwickelt. Mit dem Pre-Seed werden die ersten vier Schlüssel-Hires gesetzt: Head of Operations, zwei Care-Manager, ein Growth Marketer und ein Partner-Manager.</w:t>
       </w:r>
     </w:p>
     <w:p>
@@ -1376,7 +1376,7 @@
                 <w:sz w:val="20"/>
                 <w:szCs w:val="20"/>
               </w:rPr>
-              <w:t xml:space="preserve">Yusuf Cilcioglu — Full-Stack-Entwickler, CEO &amp; CTO</w:t>
+              <w:t xml:space="preserve">Yusuf Ferhat Demir — Full-Stack-Entwickler, CEO &amp; CTO</w:t>
             </w:r>
           </w:p>
         </w:tc>
@@ -6327,7 +6327,7 @@
           <w:sz w:val="26"/>
           <w:szCs w:val="26"/>
         </w:rPr>
-        <w:t xml:space="preserve">Gründer — Yusuf Cilcioglu</w:t>
+        <w:t xml:space="preserve">Gründer — Yusuf Ferhat Demir</w:t>
       </w:r>
     </w:p>
     <w:p>
@@ -6342,7 +6342,7 @@
           <w:sz w:val="22"/>
           <w:szCs w:val="22"/>
         </w:rPr>
-        <w:t xml:space="preserve">Yusuf Cilcioglu ist Gründer, CEO und CTO von AlltagsEngel in Personalunion. Frankfurter mit türkisch-deutschen Wurzeln, Full-Stack-Entwickler und Product-Led-Founder. In den vergangenen vier Monaten hat er AlltagsEngel als Solo-Operation von der ersten Code-Zeile bis zum produktionsreifen Live-Produkt entwickelt — inklusive native iOS/Android App via Capacitor, Next.js Web-App, Supabase-Backend mit vollständiger Row-Level-Security und mehrstufiger Admin-Infrastruktur.</w:t>
+        <w:t xml:space="preserve">Yusuf Ferhat Demir ist Gründer, CEO und CTO von AlltagsEngel in Personalunion. Frankfurter mit türkisch-deutschen Wurzeln, Full-Stack-Entwickler und Product-Led-Founder. In den vergangenen vier Monaten hat er AlltagsEngel als Solo-Operation von der ersten Code-Zeile bis zum produktionsreifen Live-Produkt entwickelt — inklusive native iOS/Android App via Capacitor, Next.js Web-App, Supabase-Backend mit vollständiger Row-Level-Security und mehrstufiger Admin-Infrastruktur.</w:t>
       </w:r>
     </w:p>
     <w:p>
@@ -14066,7 +14066,7 @@
           <w:sz w:val="22"/>
           <w:szCs w:val="22"/>
         </w:rPr>
-        <w:t xml:space="preserve">Yusuf Cilcioglu · +49 178 338 2825 · hallo@alltagsengel.care</w:t>
+        <w:t xml:space="preserve">Yusuf Ferhat Demir · +49 178 338 2825 · hallo@alltagsengel.care</w:t>
       </w:r>
     </w:p>
     <w:p>

</xml_diff>

<commit_message>
fix(investor): App-Style Icons (Gold-Gradient), Logo auf allen Slides, info@alltagsengel.care
- Pitch Deck: 8 App-Icons im Gold-Gradient-Stil der AlltagsEngel-App (Krankenwagen, Pflegebox, Engel, Arzt-Kreuz, Handshake, Home, Star, Founder-Silhouette)
- Logo-Mark oben rechts auf allen 14 Slides (Cover + Closing haben eigene Logo-Platzierung, 2-13 via addBrandLogo())
- E-Mail überall auf info@alltagsengel.care vereinheitlicht (statt hallo@ / y.cilcioglu@)
- Alle 4 Deliverables neu gebaut und verifiziert (pitchdeck, businessplan, onepager, qa)
</commit_message>
<xml_diff>
--- a/investor/AlltagsEngel_Businessplan_2026.docx
+++ b/investor/AlltagsEngel_Businessplan_2026.docx
@@ -162,7 +162,7 @@
           <w:sz w:val="20"/>
           <w:szCs w:val="20"/>
         </w:rPr>
-        <w:t xml:space="preserve">+49 178 338 2825 · hallo@alltagsengel.care</w:t>
+        <w:t xml:space="preserve">+49 178 338 2825 · info@alltagsengel.care</w:t>
       </w:r>
     </w:p>
     <w:p>
@@ -1590,7 +1590,7 @@
                 <w:sz w:val="20"/>
                 <w:szCs w:val="20"/>
               </w:rPr>
-              <w:t xml:space="preserve">+49 178 338 2825 · hallo@alltagsengel.care</w:t>
+              <w:t xml:space="preserve">+49 178 338 2825 · info@alltagsengel.care</w:t>
             </w:r>
           </w:p>
         </w:tc>
@@ -14066,7 +14066,7 @@
           <w:sz w:val="22"/>
           <w:szCs w:val="22"/>
         </w:rPr>
-        <w:t xml:space="preserve">Yusuf Ferhat Demir · +49 178 338 2825 · hallo@alltagsengel.care</w:t>
+        <w:t xml:space="preserve">Yusuf Ferhat Demir · +49 178 338 2825 · info@alltagsengel.care</w:t>
       </w:r>
     </w:p>
     <w:p>

</xml_diff>

<commit_message>
fix(investor): HRB 140351 + UG (haftungsbeschränkt) überall, Founder-Kreis mit YFD-Initialen
- Pitch Deck Cover/Closing: UG (i.G.) → UG (haftungsbeschränkt) · HRB 140351
- Pitch Deck Timeline Q4 2025: UG-Gründung + HRB 140351 Hinweis
- Pitch Deck Team-Slide: Founder-Kreis jetzt YFD-Initialen in Gold-Italic (statt generisches Person-Icon)
- Businessplan Unternehmensdaten: Firma/Rechtsform auf UG (haftungsbeschränkt) · HRB 140351, AG Frankfurt
- OnePager: Rechtsform-Fakt mit HRB 140351 statt 'Gegründet 2025', Status ergänzt um Frankfurt
- Rebuild: PPTX, PDFs (soffice), Kopie nach /investor/
</commit_message>
<xml_diff>
--- a/investor/AlltagsEngel_Businessplan_2026.docx
+++ b/investor/AlltagsEngel_Businessplan_2026.docx
@@ -1164,7 +1164,7 @@
                 <w:sz w:val="20"/>
                 <w:szCs w:val="20"/>
               </w:rPr>
-              <w:t xml:space="preserve">AlltagsEngel (Gründung: 2026)</w:t>
+              <w:t xml:space="preserve">AlltagsEngel UG (haftungsbeschränkt)</w:t>
             </w:r>
           </w:p>
         </w:tc>
@@ -1234,7 +1234,7 @@
                 <w:sz w:val="20"/>
                 <w:szCs w:val="20"/>
               </w:rPr>
-              <w:t xml:space="preserve">Einzelunternehmung → Umwandlung zur UG/GmbH bei Investment geplant</w:t>
+              <w:t xml:space="preserve">UG (haftungsbeschränkt) · HRB 140351, Amtsgericht Frankfurt am Main</w:t>
             </w:r>
           </w:p>
         </w:tc>

</xml_diff>

<commit_message>
fix(investor): echtes App-Logo + Italics raus + Alltagshilfe statt Pflege-Plattform
- Logo: Transparente Version des echten App-Engels (icon-512x512.png)
  statt alter eckiger Engel-Grafik. Auf allen 14 Pitchdeck-Slides sichtbar.
- Italics komplett raus (16 im Pitchdeck, 7 im Businessplan, 1 im OnePager).
  User: 'sind keine piraten'. Alle Headlines, YFD-Initialen, Quotes aufrecht.
- Self-Positioning 'Pflege-Plattform' entfernt — AlltagsEngel ist Alltagshilfe
  und Entlastung, kein Pflegedienst. Gesetzliche Begriffe (Pflegebedürftige,
  §45b SGB XI, Pflegebox §40) bleiben.
- Icons im Pitchdeck sind verifiziert byte-gleich zu components/Icons.tsx
  (Pfade + Gradient-Stops identisch).

Rebuild: pitchdeck.pptx, businessplan.docx, onepager.pdf, qa.docx
+ PDF-Exporte via soffice. Kopie nach /investor/ aktualisiert.
</commit_message>
<xml_diff>
--- a/investor/AlltagsEngel_Businessplan_2026.docx
+++ b/investor/AlltagsEngel_Businessplan_2026.docx
@@ -57,7 +57,7 @@
           <w:sz w:val="28"/>
           <w:szCs w:val="28"/>
         </w:rPr>
-        <w:t xml:space="preserve">Die erste All-in-One Plattform für Pflege, Alltag und Mobilität.</w:t>
+        <w:t xml:space="preserve">Die erste All-in-One Plattform für Alltag, Entlastung und Mobilität.</w:t>
       </w:r>
     </w:p>
     <w:p>
@@ -1448,7 +1448,7 @@
                 <w:sz w:val="20"/>
                 <w:szCs w:val="20"/>
               </w:rPr>
-              <w:t xml:space="preserve">DigitalHealth · AgeTech · Pflege-Plattform</w:t>
+              <w:t xml:space="preserve">AgeTech · Alltagshilfe · Krankenfahrten · Pflegebox-Logistik</w:t>
             </w:r>
           </w:p>
         </w:tc>
@@ -4127,7 +4127,7 @@
           <w:sz w:val="22"/>
           <w:szCs w:val="22"/>
         </w:rPr>
-        <w:t xml:space="preserve">Der Pflege-Plattform-Markt in Deutschland ist strukturell fragmentiert. Kein einziger Wettbewerber deckt heute die Kombination aus Alltagshilfe, Krankenfahrten und Pflegeboxen in einer App ab. Die wichtigsten Player sind:</w:t>
+        <w:t xml:space="preserve">Der Alltagshilfe- und Entlastungs-Markt in Deutschland ist strukturell fragmentiert. Kein einziger Wettbewerber deckt heute die Kombination aus Alltagshilfe, Krankenfahrten und Pflegeboxen in einer App ab. Die wichtigsten Player sind:</w:t>
       </w:r>
     </w:p>
     <w:p>
@@ -13369,7 +13369,7 @@
           <w:sz w:val="22"/>
           <w:szCs w:val="22"/>
         </w:rPr>
-        <w:t xml:space="preserve">Gegenmaßnahme: Lokales Engel-Netzwerk und Kassen-Direktverträge sind kein reines Tech-Spiel — schwer replizierbar. Zudem ist die Kategorie 'integrierte Pflege-Plattform' neu; ein First-Mover-Advantage in den drei Gründungsstädten ist wesentlich.</w:t>
+        <w:t xml:space="preserve">Gegenmaßnahme: Lokales Engel-Netzwerk und Kassen-Direktverträge sind kein reines Tech-Spiel — schwer replizierbar. Zudem ist die Kategorie 'integrierte Alltagshilfe-Plattform' neu; ein First-Mover-Advantage in den drei Gründungsstädten ist wesentlich.</w:t>
       </w:r>
     </w:p>
     <w:p>
@@ -14000,7 +14000,7 @@
           <w:sz w:val="22"/>
           <w:szCs w:val="22"/>
         </w:rPr>
-        <w:t xml:space="preserve">Wir suchen Investoren, die nicht nur Kapital bereitstellen, sondern die Vision einer integrierten digitalen Pflege-Plattform teilen und mit ihrem Netzwerk (Kassen, Apotheken, Sanitätshäuser, Pflegegruppen) den Markteintritt beschleunigen können.</w:t>
+        <w:t xml:space="preserve">Wir suchen Investoren, die nicht nur Kapital bereitstellen, sondern die Vision einer integrierten digitalen Alltagshilfe- und Entlastungs-Plattform teilen und mit ihrem Netzwerk (Kassen, Apotheken, Sanitätshäuser, Pflegegruppen) den Markteintritt beschleunigen können.</w:t>
       </w:r>
     </w:p>
     <w:p>

</xml_diff>

<commit_message>
fix(investor): Pflege/Alltagsbegleitung klar getrennt + Bewertungssystem fuer Engel und Fahrten
- Businessplan: neues Kapitel Qualitaet und Vertrauen mit 5 H3-Sektionen
- Businessplan: TOC + Kapitel 3 Pflege-Markt zu Entlastungs-Landschaft
- Businessplan: Engel = landesrechtlich anerkannte Alltagshelfer statt Pflegekraefte
- Businessplan: expliziter Disclaimer + Risiko-Zeile Abgrenzung vs Pflegedienst
- Pitch Deck: Wettbewerbsmatrix-Achse Pflege-Fokus zu Kassen-abgerechnet
- QA: 2 neue Fragen Qualitaetssicherung + Alltagshelfer vs Pflegekraefte
- OnePager: Loesungs-Absatz erweitert, Titel 22 auf 18pt damit 1 Seite
</commit_message>
<xml_diff>
--- a/investor/AlltagsEngel_Businessplan_2026.docx
+++ b/investor/AlltagsEngel_Businessplan_2026.docx
@@ -251,7 +251,7 @@
           <w:sz w:val="22"/>
           <w:szCs w:val="22"/>
         </w:rPr>
-        <w:t xml:space="preserve">3. Problem — der deutsche Pflege-Markt 2026</w:t>
+        <w:t xml:space="preserve">3. Problem — die deutsche Entlastungs-Landschaft 2026</w:t>
       </w:r>
       <w:r>
         <w:rPr>
@@ -681,7 +681,7 @@
           <w:sz w:val="22"/>
           <w:szCs w:val="22"/>
         </w:rPr>
-        <w:t xml:space="preserve">AlltagsEngel ist eine mobile Plattform mit Sitz in Frankfurt am Main, die Pflegebedürftige, Alltagsengel (Alltagshelfer und Pflegekräfte) sowie zertifizierte Krankentransport-Fahrer in einem einzigen Ökosystem verbindet. Die App ist seit April 2026 als Next.js-PWA und native iOS/Android-App verfügbar (beta), basiert auf Supabase und ist produktionsreif ausgerollt. Erste Kunden und Alltagsengel sind onboarded; das Unternehmen befindet sich unmittelbar vor der kommerziellen Markteinführung.</w:t>
+        <w:t xml:space="preserve">AlltagsEngel ist eine mobile Plattform mit Sitz in Frankfurt am Main, die Pflegebedürftige, Alltagsengel (landesrechtlich anerkannte Alltagshelfer nach §45a SGB XI) sowie zertifizierte Krankentransport-Fahrer in einem einzigen Ökosystem verbindet. Wichtige Klarstellung: AlltagsEngel erbringt keine Grundpflege oder Behandlungspflege nach SGB V/XI — wir sind eine Alltagsbegleitungs- und Entlastungs-Plattform. Die App ist seit April 2026 als Next.js-PWA und native iOS/Android-App verfügbar (beta), basiert auf Supabase und ist produktionsreif ausgerollt. Erste Kunden und Alltagsengel sind onboarded; das Unternehmen befindet sich unmittelbar vor der kommerziellen Markteinführung.</w:t>
       </w:r>
     </w:p>
     <w:p>
@@ -713,7 +713,7 @@
           <w:sz w:val="22"/>
           <w:szCs w:val="22"/>
         </w:rPr>
-        <w:t xml:space="preserve">Der deutsche Pflege-Markt ist mit 5,2 Millionen Pflegebedürftigen (Destatis 2025) und einem jährlichen Volumen von über 50 Milliarden Euro einer der größten Sozialmärkte Europas. Über 60 Prozent des §45b-Entlastungsbudgets (131 Euro pro Monat pro Kassen-Pflegegrad) verfallen ungenutzt, weil die Antrags- und Abrechnungsbürokratie für Angehörige nicht bewältigbar ist. Gleichzeitig sind Alltagshilfe, Krankenfahrten und Pflegehilfsmittel in Deutschland vollständig fragmentiert: drei Apps, drei Rechnungen, drei Anrufe.</w:t>
+        <w:t xml:space="preserve">Deutschland zählt 5,2 Millionen Pflegebedürftige (Destatis 2025) — und für jeden davon stellt die Pflegeversicherung Entlastungs-Budgets bereit, die heute massenhaft verfallen. Über 60 Prozent des §45b-Entlastungsbudgets (131 Euro pro Monat pro Kassen-Pflegegrad) werden nicht abgerufen, weil die Antrags- und Abrechnungsbürokratie für Angehörige nicht bewältigbar ist. Gleichzeitig sind Alltagshilfe, Krankenfahrten und Pflegehilfsmittel in Deutschland vollständig fragmentiert: drei Apps, drei Rechnungen, drei Anrufe. Der Alltagshilfe- und Entlastungs-Markt als eigene Kategorie — abgegrenzt von klassischen Pflegediensten — ist heute weitgehend unbearbeitet.</w:t>
       </w:r>
     </w:p>
     <w:p>
@@ -991,7 +991,7 @@
           <w:sz w:val="22"/>
           <w:szCs w:val="22"/>
         </w:rPr>
-        <w:t xml:space="preserve">Jeder Pflegebedürftige in Deutschland soll mit einer App alles bekommen, was er im Alltag braucht — Hilfe, Fahrten, Produkte, Abrechnung. Pflege soll so einfach werden wie Essen bestellen.</w:t>
+        <w:t xml:space="preserve">Jeder Pflegebedürftige in Deutschland soll mit einer App alles bekommen, was er im Alltag braucht — Hilfe, Fahrten, Produkte, Abrechnung. Alltagshilfe und Entlastung sollen so einfach werden wie Essen bestellen.</w:t>
       </w:r>
     </w:p>
     <w:p>
@@ -1021,7 +1021,7 @@
           <w:sz w:val="22"/>
           <w:szCs w:val="22"/>
         </w:rPr>
-        <w:t xml:space="preserve">Unsere Vision ist, diese drei Welten in einer einzigen digitalen Plattform zu vereinen — so natürlich, dass eine 78-jährige Angehörige ihre Mutter mit drei Klicks in einer App versorgen kann. Langfristig wollen wir die betriebssystem-ähnliche Infrastruktur für ambulante Pflege in Deutschland werden: Jede Kasse rechnet über uns ab, jedes Sanitätshaus liefert über uns, jede Pflegebezogene Dienstleistung läuft durch unser Routing.</w:t>
+        <w:t xml:space="preserve">Unsere Vision ist, diese drei Welten in einer einzigen digitalen Plattform zu vereinen — so natürlich, dass eine 78-jährige Angehörige ihre Mutter mit drei Klicks in einer App versorgen kann. Langfristig wollen wir die betriebssystem-ähnliche Infrastruktur für Alltagsbegleitung und Entlastung in Deutschland werden: Jede Kasse rechnet über uns ab, jedes Sanitätshaus liefert über uns, jede entlastungsnahe Dienstleistung läuft durch unser Routing. Wir grenzen uns dabei klar von der medizinischen Pflege ab — Grundpflege und Behandlungspflege bleiben Aufgabe ambulanter Pflegedienste und sind nicht Teil unseres Leistungsspektrums.</w:t>
       </w:r>
     </w:p>
     <w:p>
@@ -1960,7 +1960,7 @@
           <w:sz w:val="36"/>
           <w:szCs w:val="36"/>
         </w:rPr>
-        <w:t xml:space="preserve">3. Problem — der deutsche Pflege-Markt 2026</w:t>
+        <w:t xml:space="preserve">3. Problem — die deutsche Entlastungs-Landschaft 2026</w:t>
       </w:r>
     </w:p>
     <w:p>
@@ -2288,7 +2288,7 @@
           <w:sz w:val="22"/>
           <w:szCs w:val="22"/>
         </w:rPr>
-        <w:t xml:space="preserve">Die größten deutschen Plattformen in angrenzenden Märkten haben das Pflege-Problem nicht adressiert. Helpling ist eine Haushalts-Plattform ohne Kassen-Abrechnung. Home Instead ist ein hochpreisiger Full-Service-Anbieter für die obere Mittelschicht (keine Kassenfinanzierung). Curendo digitalisiert nur den Antrag, nicht die Leistung. ProCare Deutschland liefert hervorragend Pflegeboxen, deckt aber Alltagshilfe und Fahrten nicht ab. Klassische ambulante Pflegedienste sind lokal, analog und nicht skalierbar.</w:t>
+        <w:t xml:space="preserve">Die größten deutschen Plattformen in angrenzenden Märkten haben das Alltagshilfe- und Entlastungs-Problem nicht adressiert. Helpling ist eine Haushalts-Plattform ohne Kassen-Abrechnung. Home Instead ist ein hochpreisiger Full-Service-Anbieter für die obere Mittelschicht (keine Kassenfinanzierung). Curendo digitalisiert nur den Antrag, nicht die Leistung. ProCare Deutschland liefert hervorragend Pflegeboxen, deckt aber Alltagshilfe und Fahrten nicht ab. Klassische ambulante Pflegedienste erbringen medizinische Pflege (Grund- und Behandlungspflege) — ein anderes Marktsegment als unseres — und sind dort lokal, analog und nicht skalierbar.</w:t>
       </w:r>
     </w:p>
     <w:p>
@@ -2353,7 +2353,7 @@
           <w:sz w:val="22"/>
           <w:szCs w:val="22"/>
         </w:rPr>
-        <w:t xml:space="preserve">AlltagsEngel ist eine mobile Plattform, die drei Nutzergruppen — Kunden, Engel (Alltagshelfer und Pflegekräfte) und Fahrer (Krankentransport-Partner) — in einem einzigen technischen System zusammenführt. Alle drei arbeiten im gleichen Terminsystem, sehen ihre Buchungen im gleichen Kalender und rechnen über die gleiche Schnittstelle ab.</w:t>
+        <w:t xml:space="preserve">AlltagsEngel ist eine mobile Plattform, die drei Nutzergruppen — Kunden, Engel (landesrechtlich anerkannte Alltagshelfer nach §45a SGB XI) und Fahrer (Krankentransport-Partner) — in einem einzigen technischen System zusammenführt. Alle drei arbeiten im gleichen Terminsystem, sehen ihre Buchungen im gleichen Kalender und rechnen über die gleiche Schnittstelle ab. Die Engel erbringen ausschließlich Alltagsbegleitung, Haushaltsunterstützung und Betreuung — keine Grund- oder Behandlungspflege.</w:t>
       </w:r>
     </w:p>
     <w:p>
@@ -3062,7 +3062,7 @@
           <w:sz w:val="26"/>
           <w:szCs w:val="26"/>
         </w:rPr>
-        <w:t xml:space="preserve">Rolle 2 — Engel (Alltagshelfer und Pflegekräfte)</w:t>
+        <w:t xml:space="preserve">Rolle 2 — Engel (landesrechtlich anerkannte Alltagshelfer)</w:t>
       </w:r>
     </w:p>
     <w:p>
@@ -3077,7 +3077,7 @@
           <w:sz w:val="22"/>
           <w:szCs w:val="22"/>
         </w:rPr>
-        <w:t xml:space="preserve">Die Engel-App richtet sich an zertifizierte Alltagshelfer (landesrechtlich anerkannt nach §45a SGB XI) und examinierte Pflegekräfte. Ziel ist, ihnen ein kalkulierbares Einkommen, Planungssicherheit und administrative Entlastung zu bieten.</w:t>
+        <w:t xml:space="preserve">Die Engel-App richtet sich an zertifizierte Alltagshelfer, die nach §45a SGB XI landesrechtlich anerkannt sind (in Hessen: 40-Stunden-Basiskurs + Nachweis). Bewusst adressieren wir keine examinierten Pflegefachkräfte — unser Leistungsspektrum ist Alltagsbegleitung, nicht Grund- oder Behandlungspflege. Ziel ist, den Engeln ein kalkulierbares Einkommen, Planungssicherheit und administrative Entlastung zu bieten.</w:t>
       </w:r>
     </w:p>
     <w:p>
@@ -3444,6 +3444,198 @@
           <w:szCs w:val="22"/>
         </w:rPr>
         <w:t xml:space="preserve">Bei mehreren Fahrten pro Tag schlägt das System eine optimale Route vor.</w:t>
+      </w:r>
+    </w:p>
+    <w:p>
+      <w:pPr>
+        <w:pStyle w:val="Heading2"/>
+        <w:spacing w:after="160" w:before="320"/>
+      </w:pPr>
+      <w:r>
+        <w:rPr>
+          <w:rFonts w:ascii="Cambria" w:cs="Cambria" w:eastAsia="Cambria" w:hAnsi="Cambria"/>
+          <w:b/>
+          <w:bCs/>
+          <w:color w:val="1A1612"/>
+          <w:sz w:val="26"/>
+          <w:szCs w:val="26"/>
+        </w:rPr>
+        <w:t xml:space="preserve">Qualität &amp; Vertrauen — Bewertungssystem für Engel und Fahrten</w:t>
+      </w:r>
+    </w:p>
+    <w:p>
+      <w:pPr>
+        <w:spacing w:after="120" w:line="300"/>
+        <w:jc w:val="both"/>
+      </w:pPr>
+      <w:r>
+        <w:rPr>
+          <w:rFonts w:ascii="Calibri" w:cs="Calibri" w:eastAsia="Calibri" w:hAnsi="Calibri"/>
+          <w:color w:val="1A1612"/>
+          <w:sz w:val="22"/>
+          <w:szCs w:val="22"/>
+        </w:rPr>
+        <w:t xml:space="preserve">Die Plattform steht und fällt mit der Qualität der Erfahrung, die ein 80-jähriger Kunde mit einem Engel oder Fahrer macht. Deshalb ist das Bewertungssystem kein Nice-to-have, sondern ein zentrales Infrastruktur-Element — vergleichbar mit dem, was Uber für Fahrer-Qualität und Airbnb für Unterkunfts-Qualität in ihren Märkten etabliert haben. Bei uns bewertet jede Seite jede Interaktion, und die Bewertungen steuern das Matching, das Badge-System und die Care-Manager-Intervention.</w:t>
+      </w:r>
+    </w:p>
+    <w:p>
+      <w:pPr>
+        <w:pStyle w:val="Heading3"/>
+        <w:spacing w:after="100" w:before="220"/>
+      </w:pPr>
+      <w:r>
+        <w:rPr>
+          <w:rFonts w:ascii="Calibri" w:cs="Calibri" w:eastAsia="Calibri" w:hAnsi="Calibri"/>
+          <w:b/>
+          <w:bCs/>
+          <w:color w:val="1A1612"/>
+          <w:sz w:val="22"/>
+          <w:szCs w:val="22"/>
+        </w:rPr>
+        <w:t xml:space="preserve">Engel-Bewertung nach jedem Termin</w:t>
+      </w:r>
+    </w:p>
+    <w:p>
+      <w:pPr>
+        <w:spacing w:after="120" w:line="300"/>
+        <w:jc w:val="both"/>
+      </w:pPr>
+      <w:r>
+        <w:rPr>
+          <w:rFonts w:ascii="Calibri" w:cs="Calibri" w:eastAsia="Calibri" w:hAnsi="Calibri"/>
+          <w:color w:val="1A1612"/>
+          <w:sz w:val="22"/>
+          <w:szCs w:val="22"/>
+        </w:rPr>
+        <w:t xml:space="preserve">Nach jeder abgeschlossenen Alltagshilfe-Stunde bekommt der Kunde (oder der buchende Angehörige) eine Push-Benachrichtigung mit einer 1-bis-5-Sterne-Skala plus optionalem Freitext. Die Bewertung läuft über drei Dimensionen: Pünktlichkeit, Freundlichkeit und Qualität der Ausführung. Ein Termin ohne Bewertung wird nach 72 Stunden automatisch als neutrale 4-Sterne-Bewertung gezählt, damit Engel nicht durch schweigsame Kunden benachteiligt werden. Durchschnittsbewertung, Zahl der Bewertungen und Beispiel-Kommentare sind für jeden Engel im Kunden-Feed sichtbar — Transparenz ist die wichtigste Vertrauens-Ressource in einem Markt, in dem ältere Kunden schlechte Erfahrungen mit Pflegedienstleistern gemacht haben.</w:t>
+      </w:r>
+    </w:p>
+    <w:p>
+      <w:pPr>
+        <w:pStyle w:val="Heading3"/>
+        <w:spacing w:after="100" w:before="220"/>
+      </w:pPr>
+      <w:r>
+        <w:rPr>
+          <w:rFonts w:ascii="Calibri" w:cs="Calibri" w:eastAsia="Calibri" w:hAnsi="Calibri"/>
+          <w:b/>
+          <w:bCs/>
+          <w:color w:val="1A1612"/>
+          <w:sz w:val="22"/>
+          <w:szCs w:val="22"/>
+        </w:rPr>
+        <w:t xml:space="preserve">Fahrten-Bewertung nach jeder Krankenfahrt</w:t>
+      </w:r>
+    </w:p>
+    <w:p>
+      <w:pPr>
+        <w:spacing w:after="120" w:line="300"/>
+        <w:jc w:val="both"/>
+      </w:pPr>
+      <w:r>
+        <w:rPr>
+          <w:rFonts w:ascii="Calibri" w:cs="Calibri" w:eastAsia="Calibri" w:hAnsi="Calibri"/>
+          <w:color w:val="1A1612"/>
+          <w:sz w:val="22"/>
+          <w:szCs w:val="22"/>
+        </w:rPr>
+        <w:t xml:space="preserve">Krankenfahrten sind ein eigener Qualitäts-Kontext: Hier geht es weniger um Sympathie und mehr um Pünktlichkeit, Fahrzeug-Zustand und Umgang mit dem Patienten beim Ein- und Aussteigen. Die Fahrt-Bewertung läuft deshalb nach einer eigenen 1-bis-5-Sterne-Skala mit drei Dimensionen: Pünktlichkeit, Fahrzeug-Sauberkeit und Fahrweise. Die Bewertung kann direkt in der App abgegeben werden, sobald der Kunde wieder zu Hause ist, und fließt in die Fahrer-Reputation ein. Fahrer mit einem 90-Tage-Schnitt unter 4,0 Sterne werden von neuen Rezept-Matches vorübergehend ausgeschlossen, bis eine Care-Manager-Review stattgefunden hat.</w:t>
+      </w:r>
+    </w:p>
+    <w:p>
+      <w:pPr>
+        <w:pStyle w:val="Heading3"/>
+        <w:spacing w:after="100" w:before="220"/>
+      </w:pPr>
+      <w:r>
+        <w:rPr>
+          <w:rFonts w:ascii="Calibri" w:cs="Calibri" w:eastAsia="Calibri" w:hAnsi="Calibri"/>
+          <w:b/>
+          <w:bCs/>
+          <w:color w:val="1A1612"/>
+          <w:sz w:val="22"/>
+          <w:szCs w:val="22"/>
+        </w:rPr>
+        <w:t xml:space="preserve">Verified-Badge-Progression</w:t>
+      </w:r>
+    </w:p>
+    <w:p>
+      <w:pPr>
+        <w:spacing w:after="120" w:line="300"/>
+        <w:jc w:val="both"/>
+      </w:pPr>
+      <w:r>
+        <w:rPr>
+          <w:rFonts w:ascii="Calibri" w:cs="Calibri" w:eastAsia="Calibri" w:hAnsi="Calibri"/>
+          <w:color w:val="1A1612"/>
+          <w:sz w:val="22"/>
+          <w:szCs w:val="22"/>
+        </w:rPr>
+        <w:t xml:space="preserve">Das Bewertungssystem ist an ein Badge-System gekoppelt, das für Engel und Fahrer langfristige Anreize setzt: Neue Engel starten als 'Aktiv' (grün). Nach 20 Terminen mit durchschnittlich 4,6+ Sterne erhalten sie 'Verifiziert' (gold). Nach 50 Terminen mit 4,8+ Sterne erhalten sie 'Verified Premium' — und werden im Kunden-Feed priorisiert sowie mit +1,50 €/h Bonus entlohnt. Fahrer durchlaufen die gleiche dreistufige Progression auf Basis von Fahrten statt Stunden. Die Badges sind für Kunden sichtbar und dienen als Qualitäts-Signal im Matching.</w:t>
+      </w:r>
+    </w:p>
+    <w:p>
+      <w:pPr>
+        <w:pStyle w:val="Heading3"/>
+        <w:spacing w:after="100" w:before="220"/>
+      </w:pPr>
+      <w:r>
+        <w:rPr>
+          <w:rFonts w:ascii="Calibri" w:cs="Calibri" w:eastAsia="Calibri" w:hAnsi="Calibri"/>
+          <w:b/>
+          <w:bCs/>
+          <w:color w:val="1A1612"/>
+          <w:sz w:val="22"/>
+          <w:szCs w:val="22"/>
+        </w:rPr>
+        <w:t xml:space="preserve">Care-Manager-Eskalation bei Negativ-Bewertungen</w:t>
+      </w:r>
+    </w:p>
+    <w:p>
+      <w:pPr>
+        <w:spacing w:after="120" w:line="300"/>
+        <w:jc w:val="both"/>
+      </w:pPr>
+      <w:r>
+        <w:rPr>
+          <w:rFonts w:ascii="Calibri" w:cs="Calibri" w:eastAsia="Calibri" w:hAnsi="Calibri"/>
+          <w:color w:val="1A1612"/>
+          <w:sz w:val="22"/>
+          <w:szCs w:val="22"/>
+        </w:rPr>
+        <w:t xml:space="preserve">Jede Bewertung unter 3 Sterne löst automatisch ein Ticket im Care-Manager-Backoffice aus. Der zuständige Care-Manager nimmt innerhalb von 24 Stunden Kontakt mit dem Kunden auf, klärt den Vorfall, dokumentiert die Rückmeldung und entscheidet über Konsequenzen: Vermittlungs-Pause, Schulungsgespräch oder Plattform-Ausschluss. Dieser menschliche Kontroll-Loop ist der Grund, warum wir bewusst auf vollautomatische Sperrungen verzichten — in einem Markt mit 80-jährigen Kunden kann eine einzelne Negativ-Bewertung viele legitime Ursachen haben, von Sprachbarrieren bis Tagesform.</w:t>
+      </w:r>
+    </w:p>
+    <w:p>
+      <w:pPr>
+        <w:pStyle w:val="Heading3"/>
+        <w:spacing w:after="100" w:before="220"/>
+      </w:pPr>
+      <w:r>
+        <w:rPr>
+          <w:rFonts w:ascii="Calibri" w:cs="Calibri" w:eastAsia="Calibri" w:hAnsi="Calibri"/>
+          <w:b/>
+          <w:bCs/>
+          <w:color w:val="1A1612"/>
+          <w:sz w:val="22"/>
+          <w:szCs w:val="22"/>
+        </w:rPr>
+        <w:t xml:space="preserve">Gegenseitige Bewertung — auch Engel bewerten Kunden</w:t>
+      </w:r>
+    </w:p>
+    <w:p>
+      <w:pPr>
+        <w:spacing w:after="120" w:line="300"/>
+        <w:jc w:val="both"/>
+      </w:pPr>
+      <w:r>
+        <w:rPr>
+          <w:rFonts w:ascii="Calibri" w:cs="Calibri" w:eastAsia="Calibri" w:hAnsi="Calibri"/>
+          <w:color w:val="1A1612"/>
+          <w:sz w:val="22"/>
+          <w:szCs w:val="22"/>
+        </w:rPr>
+        <w:t xml:space="preserve">Um Reputationsrisiken symmetrisch zu verteilen, können auch Engel und Fahrer Kunden bewerten (1-5 Sterne, interne Sichtbarkeit nur für Care-Manager und Matching-Algorithmus). Kunden mit wiederholt niedrigen Engel-Bewertungen (z. B. wegen unfreundlichem Verhalten oder unrealistischen Erwartungen) werden bei der Vermittlung von neuen Terminen an erfahrene Engel mit gutem Konflikt-Management geroutet. Das schützt neue Engel und senkt die Fluktuation in den ersten 90 Tagen — eine der größten Kostenfallen im Alltagshilfe-Markt.</w:t>
       </w:r>
     </w:p>
     <w:p>
@@ -13661,6 +13853,36 @@
           <w:szCs w:val="22"/>
         </w:rPr>
         <w:t xml:space="preserve">Gegenmaßnahme: Hessen-Anerkennung bereits läuft; NRW-Antrag parallel vorbereitet. Bei Verzögerung kann 100 % der Leistung über Kooperations-Pflegedienste abgerechnet werden (Sub-Contractor-Modell).</w:t>
+      </w:r>
+    </w:p>
+    <w:p>
+      <w:pPr>
+        <w:pStyle w:val="ListParagraph"/>
+        <w:numPr>
+          <w:ilvl w:val="0"/>
+          <w:numId w:val="2"/>
+        </w:numPr>
+        <w:spacing w:after="80" w:line="280"/>
+      </w:pPr>
+      <w:r>
+        <w:rPr>
+          <w:rFonts w:ascii="Calibri" w:cs="Calibri" w:eastAsia="Calibri" w:hAnsi="Calibri"/>
+          <w:b/>
+          <w:bCs/>
+          <w:color w:val="1A1612"/>
+          <w:sz w:val="22"/>
+          <w:szCs w:val="22"/>
+        </w:rPr>
+        <w:t xml:space="preserve">Abgrenzung Alltagshilfe vs. Pflegedienst: </w:t>
+      </w:r>
+      <w:r>
+        <w:rPr>
+          <w:rFonts w:ascii="Calibri" w:cs="Calibri" w:eastAsia="Calibri" w:hAnsi="Calibri"/>
+          <w:color w:val="1A1612"/>
+          <w:sz w:val="22"/>
+          <w:szCs w:val="22"/>
+        </w:rPr>
+        <w:t xml:space="preserve">AlltagsEngel erbringt ausschließlich Alltagsbegleitung und Entlastung nach §45b SGB XI — keine Grundpflege, keine Behandlungspflege, keine SGB-V-Leistungen. Gegenmaßnahme: Klare Leistungs-Kataloge in AGB und Engel-Verträgen, Schulungs-Modul 'Grenzen der Alltagsbegleitung' für neue Engel, Eskalations-Pfad zu externen Pflegediensten wenn Kunden-Bedarf die Alltagsbegleitung übersteigt. Diese Trennung schützt vor Heimaufsichts- und Kassen-Aufsichts-Risiken.</w:t>
       </w:r>
     </w:p>
     <w:p>

</xml_diff>

<commit_message>
Investor-Paket v2: detaillierter Use-of-Funds (10 Positionen)
- Gründer-Gehalt 6 T€/Mon (108 T€ · 10,8%)
- Firmenwagen Leasing 18 T€ (1,8%)
- Büro/Co-Working FFM+NRW 22 T€ (2,2%)
- Recht/Notar/Versicherung/Steuerberater 32 T€ (3,2%)
- Team 4 Hires gestaffelt 380 T€ (38%)
- Marketing 220 T€ · Expansion NRW 110 T€ · Tech 60 T€ · Puffer 50 T€

Businessplan, Pitch Deck (Slide 12), One-Pager und Finanzmodell
konsistent aufeinander abgestimmt. Personalplan-Tabelle mit 5 Hires
+ Freelancer-Puffer ergänzt. P&L und Sensitivität aktualisiert.
</commit_message>
<xml_diff>
--- a/investor/AlltagsEngel_Businessplan_2026.docx
+++ b/investor/AlltagsEngel_Businessplan_2026.docx
@@ -905,7 +905,7 @@
           <w:sz w:val="22"/>
           <w:szCs w:val="22"/>
         </w:rPr>
-        <w:t xml:space="preserve">AlltagsEngel sucht eine Pre-Seed-Finanzierung in Höhe von 1,0 Mio € zur Kapitalisierung der ersten 18 Monate. Die Verwendung verteilt sich auf: 40 % Team-Aufbau (Operations, Care, Growth, Partner), 30 % Marketing und Kundenakquise, 20 % geographische Expansion (Köln, Düsseldorf) und 10 % Technologie und Infrastruktur. Das Szenario erreicht den operativen Break-Even in Q2 2028 mit einem geplanten Jahresumsatz von 2,65 Mio € bei 1.900 aktiven Kunden.</w:t>
+        <w:t xml:space="preserve">AlltagsEngel sucht eine Pre-Seed-Finanzierung in Höhe von 1,0 Mio € zur Kapitalisierung der ersten 18 Monate. Die Verwendung verteilt sich auf: 38 % Team-Aufbau (vier operative Hires), 11 % Gründer-Gehalt (Yusuf F. Demir als CEO/CTO mit marktüblichen 6 T€/Monat brutto), 22 % Marketing und Kundenakquise, 11 % geographische Expansion (Köln, Düsseldorf), 6 % Technologie, 5 % Puffer sowie 7 % für betriebliche Grundausstattung (Firmenwagen für die 3-Städte-Betreuung, Co-Working-Büro FFM/Köln/Düsseldorf, Recht/Notar/Versicherung/Buchhaltung). Das Base-Case-Szenario erreicht den monatlichen operativen Break-Even in Q2 2028 bei einem geplanten Jahresumsatz von 2,65 Mio € und 1.900 aktiven Kunden.</w:t>
       </w:r>
     </w:p>
     <w:p>
@@ -9954,7 +9954,7 @@
                 <w:sz w:val="20"/>
                 <w:szCs w:val="20"/>
               </w:rPr>
-              <w:t xml:space="preserve">Personalkosten (T€)</w:t>
+              <w:t xml:space="preserve">Personalkosten inkl. Gründer (T€)</w:t>
             </w:r>
           </w:p>
         </w:tc>
@@ -9989,7 +9989,7 @@
                 <w:sz w:val="20"/>
                 <w:szCs w:val="20"/>
               </w:rPr>
-              <w:t xml:space="preserve">180</w:t>
+              <w:t xml:space="preserve">205</w:t>
             </w:r>
           </w:p>
         </w:tc>
@@ -10024,7 +10024,7 @@
                 <w:sz w:val="20"/>
                 <w:szCs w:val="20"/>
               </w:rPr>
-              <w:t xml:space="preserve">420</w:t>
+              <w:t xml:space="preserve">490</w:t>
             </w:r>
           </w:p>
         </w:tc>
@@ -10059,7 +10059,7 @@
                 <w:sz w:val="20"/>
                 <w:szCs w:val="20"/>
               </w:rPr>
-              <w:t xml:space="preserve">680</w:t>
+              <w:t xml:space="preserve">770</w:t>
             </w:r>
           </w:p>
         </w:tc>
@@ -10234,7 +10234,7 @@
                 <w:sz w:val="20"/>
                 <w:szCs w:val="20"/>
               </w:rPr>
-              <w:t xml:space="preserve">Operations &amp; Tech (T€)</w:t>
+              <w:t xml:space="preserve">Operations, Büro, Auto, Recht (T€)</w:t>
             </w:r>
           </w:p>
         </w:tc>
@@ -10269,7 +10269,7 @@
                 <w:sz w:val="20"/>
                 <w:szCs w:val="20"/>
               </w:rPr>
-              <w:t xml:space="preserve">35</w:t>
+              <w:t xml:space="preserve">55</w:t>
             </w:r>
           </w:p>
         </w:tc>
@@ -10304,7 +10304,7 @@
                 <w:sz w:val="20"/>
                 <w:szCs w:val="20"/>
               </w:rPr>
-              <w:t xml:space="preserve">85</w:t>
+              <w:t xml:space="preserve">115</w:t>
             </w:r>
           </w:p>
         </w:tc>
@@ -10339,7 +10339,7 @@
                 <w:sz w:val="20"/>
                 <w:szCs w:val="20"/>
               </w:rPr>
-              <w:t xml:space="preserve">140</w:t>
+              <w:t xml:space="preserve">160</w:t>
             </w:r>
           </w:p>
         </w:tc>
@@ -10409,7 +10409,7 @@
                 <w:sz w:val="20"/>
                 <w:szCs w:val="20"/>
               </w:rPr>
-              <w:t xml:space="preserve">-283</w:t>
+              <w:t xml:space="preserve">-328</w:t>
             </w:r>
           </w:p>
         </w:tc>
@@ -10443,7 +10443,7 @@
                 <w:sz w:val="20"/>
                 <w:szCs w:val="20"/>
               </w:rPr>
-              <w:t xml:space="preserve">-481</w:t>
+              <w:t xml:space="preserve">-581</w:t>
             </w:r>
           </w:p>
         </w:tc>
@@ -10477,7 +10477,7 @@
                 <w:sz w:val="20"/>
                 <w:szCs w:val="20"/>
               </w:rPr>
-              <w:t xml:space="preserve">-100</w:t>
+              <w:t xml:space="preserve">-210</w:t>
             </w:r>
           </w:p>
         </w:tc>
@@ -10549,7 +10549,7 @@
                 <w:sz w:val="20"/>
                 <w:szCs w:val="20"/>
               </w:rPr>
-              <w:t xml:space="preserve">-283</w:t>
+              <w:t xml:space="preserve">-328</w:t>
             </w:r>
           </w:p>
         </w:tc>
@@ -10584,7 +10584,7 @@
                 <w:sz w:val="20"/>
                 <w:szCs w:val="20"/>
               </w:rPr>
-              <w:t xml:space="preserve">-764</w:t>
+              <w:t xml:space="preserve">-909</w:t>
             </w:r>
           </w:p>
         </w:tc>
@@ -10619,7 +10619,7 @@
                 <w:sz w:val="20"/>
                 <w:szCs w:val="20"/>
               </w:rPr>
-              <w:t xml:space="preserve">-864</w:t>
+              <w:t xml:space="preserve">-1.119</w:t>
             </w:r>
           </w:p>
         </w:tc>
@@ -10829,7 +10829,7 @@
           <w:sz w:val="22"/>
           <w:szCs w:val="22"/>
         </w:rPr>
-        <w:t xml:space="preserve">Die Kostenstruktur ist stark Personal-getrieben. 2026 werden die Kosten durch den Solo-Founder (0 € Gehalt) und die ersten 3 Hires (Head of Ops, 2 Care-Manager, Growth Marketer — Gesamt ~170 k€ im Jahr) dominiert. 2027 kommen Köln-Care-Manager, Partner-Manager und ein zweiter Growth Marketer dazu; die Team-Größe wächst auf 8. 2028 wird Düsseldorf-Care-Manager hinzugefügt sowie zwei weitere Engineering-Positionen für die Skalierung.</w:t>
+        <w:t xml:space="preserve">Die Kostenstruktur ist stark Personal-getrieben. 2026 werden die Kosten dominiert durch den Gründer (Yusuf F. Demir, 6 T€/Monat brutto ab Q2 2026) und die ersten drei operativen Hires (Care-Manager 1 ab Q2, Head of Ops und Growth Marketer ab Q3) — zusammen ~205 T€ Personalkosten im Launch-Jahr. 2027 kommen ein zweiter Care-Manager (Köln, Q1), ein Partner-Manager (Q3) sowie ein zweiter Growth Marketer dazu; die Team-Größe wächst auf 7 Mitarbeiter plus Gründer (~490 T€). 2028 wird Düsseldorf-Care-Manager hinzugefügt sowie zwei weitere Engineering-Positionen für die Skalierung (~770 T€ inkl. moderate Gründergehalt-Anpassung auf 6,5 T€/Monat). Nicht-Personalkosten (Büro, Firmenwagen, Recht, Versicherung, Buchhaltung) steigen parallel mit der Team-Größe und geographischen Abdeckung.</w:t>
       </w:r>
     </w:p>
     <w:p>
@@ -11189,7 +11189,7 @@
                 <w:sz w:val="20"/>
                 <w:szCs w:val="20"/>
               </w:rPr>
-              <w:t xml:space="preserve">-260 T€</w:t>
+              <w:t xml:space="preserve">-380 T€</w:t>
             </w:r>
           </w:p>
         </w:tc>
@@ -11331,7 +11331,7 @@
                 <w:sz w:val="20"/>
                 <w:szCs w:val="20"/>
               </w:rPr>
-              <w:t xml:space="preserve">-100 T€</w:t>
+              <w:t xml:space="preserve">-210 T€</w:t>
             </w:r>
           </w:p>
         </w:tc>
@@ -11469,7 +11469,7 @@
                 <w:sz w:val="20"/>
                 <w:szCs w:val="20"/>
               </w:rPr>
-              <w:t xml:space="preserve">+180 T€</w:t>
+              <w:t xml:space="preserve">+80 T€</w:t>
             </w:r>
           </w:p>
         </w:tc>
@@ -11495,7 +11495,7 @@
           <w:sz w:val="22"/>
           <w:szCs w:val="22"/>
         </w:rPr>
-        <w:t xml:space="preserve">Selbst im konservativen Szenario bleibt der operative Verlust 2028 unter 300 T€ — das Unternehmen erreicht in 2029 auch bei ungünstigem Verlauf EBITDA-positiv. Im optimistischen Szenario ist AlltagsEngel bereits 2028 EBITDA-positiv und benötigt keine weitere Finanzierungsrunde mehr.</w:t>
+        <w:t xml:space="preserve">Auch im konservativen Szenario bleibt der operative Jahresverlust 2028 unter 400 T€ — das Unternehmen erreicht spätestens Mitte 2029 auch bei ungünstigem Verlauf EBITDA-positiv. Im Base Case wird der monatliche operative Break-Even (Monats-EBITDA ≥ 0) in Q2 2028 erreicht; der Jahresverlust 2028 entsteht durch das noch negative erste Halbjahr. Im optimistischen Szenario ist AlltagsEngel bereits im Gesamtjahr 2028 EBITDA-positiv und benötigt keine weitere Finanzierungsrunde mehr.</w:t>
       </w:r>
     </w:p>
     <w:p>
@@ -11562,12 +11562,12 @@
           <w:sz w:val="26"/>
           <w:szCs w:val="26"/>
         </w:rPr>
-        <w:t xml:space="preserve">Use-of-Funds</w:t>
+        <w:t xml:space="preserve">Use-of-Funds (detailliert, 18 Monate)</w:t>
       </w:r>
     </w:p>
     <w:tbl>
       <w:tblPr>
-        <w:tblW w:type="dxa" w:w="9000"/>
+        <w:tblW w:type="dxa" w:w="9200"/>
         <w:tblBorders>
           <w:top w:val="single" w:color="auto" w:sz="4"/>
           <w:left w:val="single" w:color="auto" w:sz="4"/>
@@ -11578,15 +11578,15 @@
         </w:tblBorders>
       </w:tblPr>
       <w:tblGrid>
-        <w:gridCol w:w="2400"/>
-        <w:gridCol w:w="1200"/>
-        <w:gridCol w:w="1200"/>
-        <w:gridCol w:w="4200"/>
+        <w:gridCol w:w="3400"/>
+        <w:gridCol w:w="900"/>
+        <w:gridCol w:w="1100"/>
+        <w:gridCol w:w="3800"/>
       </w:tblGrid>
       <w:tr>
         <w:tc>
           <w:tcPr>
-            <w:tcW w:type="dxa" w:w="2400"/>
+            <w:tcW w:type="dxa" w:w="3400"/>
             <w:tcBorders>
               <w:top w:val="single" w:color="EAE3D4" w:sz="6"/>
               <w:left w:val="single" w:color="EAE3D4" w:sz="6"/>
@@ -11621,7 +11621,7 @@
         </w:tc>
         <w:tc>
           <w:tcPr>
-            <w:tcW w:type="dxa" w:w="1200"/>
+            <w:tcW w:type="dxa" w:w="900"/>
             <w:tcBorders>
               <w:top w:val="single" w:color="EAE3D4" w:sz="6"/>
               <w:left w:val="single" w:color="EAE3D4" w:sz="6"/>
@@ -11656,7 +11656,7 @@
         </w:tc>
         <w:tc>
           <w:tcPr>
-            <w:tcW w:type="dxa" w:w="1200"/>
+            <w:tcW w:type="dxa" w:w="1100"/>
             <w:tcBorders>
               <w:top w:val="single" w:color="EAE3D4" w:sz="6"/>
               <w:left w:val="single" w:color="EAE3D4" w:sz="6"/>
@@ -11691,7 +11691,7 @@
         </w:tc>
         <w:tc>
           <w:tcPr>
-            <w:tcW w:type="dxa" w:w="4200"/>
+            <w:tcW w:type="dxa" w:w="3800"/>
             <w:tcBorders>
               <w:top w:val="single" w:color="EAE3D4" w:sz="6"/>
               <w:left w:val="single" w:color="EAE3D4" w:sz="6"/>
@@ -11728,7 +11728,7 @@
       <w:tr>
         <w:tc>
           <w:tcPr>
-            <w:tcW w:type="dxa" w:w="2400"/>
+            <w:tcW w:type="dxa" w:w="3400"/>
             <w:tcBorders>
               <w:top w:val="single" w:color="EAE3D4" w:sz="6"/>
               <w:left w:val="single" w:color="EAE3D4" w:sz="6"/>
@@ -11756,109 +11756,109 @@
                 <w:sz w:val="20"/>
                 <w:szCs w:val="20"/>
               </w:rPr>
-              <w:t xml:space="preserve">Team-Aufbau</w:t>
-            </w:r>
-          </w:p>
-        </w:tc>
-        <w:tc>
-          <w:tcPr>
-            <w:tcW w:type="dxa" w:w="1200"/>
-            <w:tcBorders>
-              <w:top w:val="single" w:color="EAE3D4" w:sz="6"/>
-              <w:left w:val="single" w:color="EAE3D4" w:sz="6"/>
-              <w:bottom w:val="single" w:color="EAE3D4" w:sz="6"/>
-              <w:right w:val="single" w:color="EAE3D4" w:sz="6"/>
-            </w:tcBorders>
-            <w:tcMar>
-              <w:top w:type="dxa" w:w="120"/>
-              <w:left w:type="dxa" w:w="160"/>
-              <w:bottom w:type="dxa" w:w="120"/>
-              <w:right w:type="dxa" w:w="160"/>
-            </w:tcMar>
-            <w:vAlign w:val="center"/>
-          </w:tcPr>
-          <w:p>
-            <w:pPr>
-              <w:jc w:val="right"/>
-            </w:pPr>
-            <w:r>
-              <w:rPr>
-                <w:rFonts w:ascii="Calibri" w:cs="Calibri" w:eastAsia="Calibri" w:hAnsi="Calibri"/>
-                <w:b w:val="false"/>
-                <w:bCs w:val="false"/>
-                <w:color w:val="1A1612"/>
-                <w:sz w:val="20"/>
-                <w:szCs w:val="20"/>
-              </w:rPr>
-              <w:t xml:space="preserve">40 %</w:t>
-            </w:r>
-          </w:p>
-        </w:tc>
-        <w:tc>
-          <w:tcPr>
-            <w:tcW w:type="dxa" w:w="1200"/>
-            <w:tcBorders>
-              <w:top w:val="single" w:color="EAE3D4" w:sz="6"/>
-              <w:left w:val="single" w:color="EAE3D4" w:sz="6"/>
-              <w:bottom w:val="single" w:color="EAE3D4" w:sz="6"/>
-              <w:right w:val="single" w:color="EAE3D4" w:sz="6"/>
-            </w:tcBorders>
-            <w:tcMar>
-              <w:top w:type="dxa" w:w="120"/>
-              <w:left w:type="dxa" w:w="160"/>
-              <w:bottom w:type="dxa" w:w="120"/>
-              <w:right w:type="dxa" w:w="160"/>
-            </w:tcMar>
-            <w:vAlign w:val="center"/>
-          </w:tcPr>
-          <w:p>
-            <w:pPr>
-              <w:jc w:val="right"/>
-            </w:pPr>
-            <w:r>
-              <w:rPr>
-                <w:rFonts w:ascii="Calibri" w:cs="Calibri" w:eastAsia="Calibri" w:hAnsi="Calibri"/>
-                <w:b w:val="false"/>
-                <w:bCs w:val="false"/>
-                <w:color w:val="1A1612"/>
-                <w:sz w:val="20"/>
-                <w:szCs w:val="20"/>
-              </w:rPr>
-              <w:t xml:space="preserve">400 T€</w:t>
-            </w:r>
-          </w:p>
-        </w:tc>
-        <w:tc>
-          <w:tcPr>
-            <w:tcW w:type="dxa" w:w="4200"/>
-            <w:tcBorders>
-              <w:top w:val="single" w:color="EAE3D4" w:sz="6"/>
-              <w:left w:val="single" w:color="EAE3D4" w:sz="6"/>
-              <w:bottom w:val="single" w:color="EAE3D4" w:sz="6"/>
-              <w:right w:val="single" w:color="EAE3D4" w:sz="6"/>
-            </w:tcBorders>
-            <w:tcMar>
-              <w:top w:type="dxa" w:w="120"/>
-              <w:left w:type="dxa" w:w="160"/>
-              <w:bottom w:type="dxa" w:w="120"/>
-              <w:right w:type="dxa" w:w="160"/>
-            </w:tcMar>
-            <w:vAlign w:val="center"/>
-          </w:tcPr>
-          <w:p>
-            <w:pPr>
-              <w:jc w:val="right"/>
-            </w:pPr>
-            <w:r>
-              <w:rPr>
-                <w:rFonts w:ascii="Calibri" w:cs="Calibri" w:eastAsia="Calibri" w:hAnsi="Calibri"/>
-                <w:b w:val="false"/>
-                <w:bCs w:val="false"/>
-                <w:color w:val="1A1612"/>
-                <w:sz w:val="20"/>
-                <w:szCs w:val="20"/>
-              </w:rPr>
-              <w:t xml:space="preserve">Head of Ops, Care-Manager x2, Growth Marketer, Partner-Manager</w:t>
+              <w:t xml:space="preserve">Team-Aufbau (4 Hires, gestaffelt)</w:t>
+            </w:r>
+          </w:p>
+        </w:tc>
+        <w:tc>
+          <w:tcPr>
+            <w:tcW w:type="dxa" w:w="900"/>
+            <w:tcBorders>
+              <w:top w:val="single" w:color="EAE3D4" w:sz="6"/>
+              <w:left w:val="single" w:color="EAE3D4" w:sz="6"/>
+              <w:bottom w:val="single" w:color="EAE3D4" w:sz="6"/>
+              <w:right w:val="single" w:color="EAE3D4" w:sz="6"/>
+            </w:tcBorders>
+            <w:tcMar>
+              <w:top w:type="dxa" w:w="120"/>
+              <w:left w:type="dxa" w:w="160"/>
+              <w:bottom w:type="dxa" w:w="120"/>
+              <w:right w:type="dxa" w:w="160"/>
+            </w:tcMar>
+            <w:vAlign w:val="center"/>
+          </w:tcPr>
+          <w:p>
+            <w:pPr>
+              <w:jc w:val="right"/>
+            </w:pPr>
+            <w:r>
+              <w:rPr>
+                <w:rFonts w:ascii="Calibri" w:cs="Calibri" w:eastAsia="Calibri" w:hAnsi="Calibri"/>
+                <w:b w:val="false"/>
+                <w:bCs w:val="false"/>
+                <w:color w:val="1A1612"/>
+                <w:sz w:val="20"/>
+                <w:szCs w:val="20"/>
+              </w:rPr>
+              <w:t xml:space="preserve">38 %</w:t>
+            </w:r>
+          </w:p>
+        </w:tc>
+        <w:tc>
+          <w:tcPr>
+            <w:tcW w:type="dxa" w:w="1100"/>
+            <w:tcBorders>
+              <w:top w:val="single" w:color="EAE3D4" w:sz="6"/>
+              <w:left w:val="single" w:color="EAE3D4" w:sz="6"/>
+              <w:bottom w:val="single" w:color="EAE3D4" w:sz="6"/>
+              <w:right w:val="single" w:color="EAE3D4" w:sz="6"/>
+            </w:tcBorders>
+            <w:tcMar>
+              <w:top w:type="dxa" w:w="120"/>
+              <w:left w:type="dxa" w:w="160"/>
+              <w:bottom w:type="dxa" w:w="120"/>
+              <w:right w:type="dxa" w:w="160"/>
+            </w:tcMar>
+            <w:vAlign w:val="center"/>
+          </w:tcPr>
+          <w:p>
+            <w:pPr>
+              <w:jc w:val="right"/>
+            </w:pPr>
+            <w:r>
+              <w:rPr>
+                <w:rFonts w:ascii="Calibri" w:cs="Calibri" w:eastAsia="Calibri" w:hAnsi="Calibri"/>
+                <w:b w:val="false"/>
+                <w:bCs w:val="false"/>
+                <w:color w:val="1A1612"/>
+                <w:sz w:val="20"/>
+                <w:szCs w:val="20"/>
+              </w:rPr>
+              <w:t xml:space="preserve">380 T€</w:t>
+            </w:r>
+          </w:p>
+        </w:tc>
+        <w:tc>
+          <w:tcPr>
+            <w:tcW w:type="dxa" w:w="3800"/>
+            <w:tcBorders>
+              <w:top w:val="single" w:color="EAE3D4" w:sz="6"/>
+              <w:left w:val="single" w:color="EAE3D4" w:sz="6"/>
+              <w:bottom w:val="single" w:color="EAE3D4" w:sz="6"/>
+              <w:right w:val="single" w:color="EAE3D4" w:sz="6"/>
+            </w:tcBorders>
+            <w:tcMar>
+              <w:top w:type="dxa" w:w="120"/>
+              <w:left w:type="dxa" w:w="160"/>
+              <w:bottom w:type="dxa" w:w="120"/>
+              <w:right w:type="dxa" w:w="160"/>
+            </w:tcMar>
+            <w:vAlign w:val="center"/>
+          </w:tcPr>
+          <w:p>
+            <w:pPr>
+              <w:jc w:val="right"/>
+            </w:pPr>
+            <w:r>
+              <w:rPr>
+                <w:rFonts w:ascii="Calibri" w:cs="Calibri" w:eastAsia="Calibri" w:hAnsi="Calibri"/>
+                <w:b w:val="false"/>
+                <w:bCs w:val="false"/>
+                <w:color w:val="1A1612"/>
+                <w:sz w:val="20"/>
+                <w:szCs w:val="20"/>
+              </w:rPr>
+              <w:t xml:space="preserve">Head of Ops, 2× Care-Manager, Growth Marketer, Partner-Manager (inkl. AG-Anteil)</w:t>
             </w:r>
           </w:p>
         </w:tc>
@@ -11866,7 +11866,7 @@
       <w:tr>
         <w:tc>
           <w:tcPr>
-            <w:tcW w:type="dxa" w:w="2400"/>
+            <w:tcW w:type="dxa" w:w="3400"/>
             <w:tcBorders>
               <w:top w:val="single" w:color="EAE3D4" w:sz="6"/>
               <w:left w:val="single" w:color="EAE3D4" w:sz="6"/>
@@ -11895,13 +11895,13 @@
                 <w:sz w:val="20"/>
                 <w:szCs w:val="20"/>
               </w:rPr>
-              <w:t xml:space="preserve">Marketing &amp; Vertrieb</w:t>
-            </w:r>
-          </w:p>
-        </w:tc>
-        <w:tc>
-          <w:tcPr>
-            <w:tcW w:type="dxa" w:w="1200"/>
+              <w:t xml:space="preserve">Gründer-Gehalt (Yusuf F. Demir, CEO/CTO)</w:t>
+            </w:r>
+          </w:p>
+        </w:tc>
+        <w:tc>
+          <w:tcPr>
+            <w:tcW w:type="dxa" w:w="900"/>
             <w:tcBorders>
               <w:top w:val="single" w:color="EAE3D4" w:sz="6"/>
               <w:left w:val="single" w:color="EAE3D4" w:sz="6"/>
@@ -11930,13 +11930,13 @@
                 <w:sz w:val="20"/>
                 <w:szCs w:val="20"/>
               </w:rPr>
-              <w:t xml:space="preserve">30 %</w:t>
-            </w:r>
-          </w:p>
-        </w:tc>
-        <w:tc>
-          <w:tcPr>
-            <w:tcW w:type="dxa" w:w="1200"/>
+              <w:t xml:space="preserve">10,8 %</w:t>
+            </w:r>
+          </w:p>
+        </w:tc>
+        <w:tc>
+          <w:tcPr>
+            <w:tcW w:type="dxa" w:w="1100"/>
             <w:tcBorders>
               <w:top w:val="single" w:color="EAE3D4" w:sz="6"/>
               <w:left w:val="single" w:color="EAE3D4" w:sz="6"/>
@@ -11965,13 +11965,13 @@
                 <w:sz w:val="20"/>
                 <w:szCs w:val="20"/>
               </w:rPr>
-              <w:t xml:space="preserve">300 T€</w:t>
-            </w:r>
-          </w:p>
-        </w:tc>
-        <w:tc>
-          <w:tcPr>
-            <w:tcW w:type="dxa" w:w="4200"/>
+              <w:t xml:space="preserve">108 T€</w:t>
+            </w:r>
+          </w:p>
+        </w:tc>
+        <w:tc>
+          <w:tcPr>
+            <w:tcW w:type="dxa" w:w="3800"/>
             <w:tcBorders>
               <w:top w:val="single" w:color="EAE3D4" w:sz="6"/>
               <w:left w:val="single" w:color="EAE3D4" w:sz="6"/>
@@ -12000,7 +12000,7 @@
                 <w:sz w:val="20"/>
                 <w:szCs w:val="20"/>
               </w:rPr>
-              <w:t xml:space="preserve">Paid Social, SEO, Apotheken-Kooperationen, PR-Events</w:t>
+              <w:t xml:space="preserve">6 T€/Monat brutto × 18 Monate (marktüblich Pre-Seed-Founder)</w:t>
             </w:r>
           </w:p>
         </w:tc>
@@ -12008,7 +12008,7 @@
       <w:tr>
         <w:tc>
           <w:tcPr>
-            <w:tcW w:type="dxa" w:w="2400"/>
+            <w:tcW w:type="dxa" w:w="3400"/>
             <w:tcBorders>
               <w:top w:val="single" w:color="EAE3D4" w:sz="6"/>
               <w:left w:val="single" w:color="EAE3D4" w:sz="6"/>
@@ -12036,109 +12036,109 @@
                 <w:sz w:val="20"/>
                 <w:szCs w:val="20"/>
               </w:rPr>
-              <w:t xml:space="preserve">Geografische Expansion</w:t>
-            </w:r>
-          </w:p>
-        </w:tc>
-        <w:tc>
-          <w:tcPr>
-            <w:tcW w:type="dxa" w:w="1200"/>
-            <w:tcBorders>
-              <w:top w:val="single" w:color="EAE3D4" w:sz="6"/>
-              <w:left w:val="single" w:color="EAE3D4" w:sz="6"/>
-              <w:bottom w:val="single" w:color="EAE3D4" w:sz="6"/>
-              <w:right w:val="single" w:color="EAE3D4" w:sz="6"/>
-            </w:tcBorders>
-            <w:tcMar>
-              <w:top w:type="dxa" w:w="120"/>
-              <w:left w:type="dxa" w:w="160"/>
-              <w:bottom w:type="dxa" w:w="120"/>
-              <w:right w:type="dxa" w:w="160"/>
-            </w:tcMar>
-            <w:vAlign w:val="center"/>
-          </w:tcPr>
-          <w:p>
-            <w:pPr>
-              <w:jc w:val="right"/>
-            </w:pPr>
-            <w:r>
-              <w:rPr>
-                <w:rFonts w:ascii="Calibri" w:cs="Calibri" w:eastAsia="Calibri" w:hAnsi="Calibri"/>
-                <w:b w:val="false"/>
-                <w:bCs w:val="false"/>
-                <w:color w:val="1A1612"/>
-                <w:sz w:val="20"/>
-                <w:szCs w:val="20"/>
-              </w:rPr>
-              <w:t xml:space="preserve">20 %</w:t>
-            </w:r>
-          </w:p>
-        </w:tc>
-        <w:tc>
-          <w:tcPr>
-            <w:tcW w:type="dxa" w:w="1200"/>
-            <w:tcBorders>
-              <w:top w:val="single" w:color="EAE3D4" w:sz="6"/>
-              <w:left w:val="single" w:color="EAE3D4" w:sz="6"/>
-              <w:bottom w:val="single" w:color="EAE3D4" w:sz="6"/>
-              <w:right w:val="single" w:color="EAE3D4" w:sz="6"/>
-            </w:tcBorders>
-            <w:tcMar>
-              <w:top w:type="dxa" w:w="120"/>
-              <w:left w:type="dxa" w:w="160"/>
-              <w:bottom w:type="dxa" w:w="120"/>
-              <w:right w:type="dxa" w:w="160"/>
-            </w:tcMar>
-            <w:vAlign w:val="center"/>
-          </w:tcPr>
-          <w:p>
-            <w:pPr>
-              <w:jc w:val="right"/>
-            </w:pPr>
-            <w:r>
-              <w:rPr>
-                <w:rFonts w:ascii="Calibri" w:cs="Calibri" w:eastAsia="Calibri" w:hAnsi="Calibri"/>
-                <w:b w:val="false"/>
-                <w:bCs w:val="false"/>
-                <w:color w:val="1A1612"/>
-                <w:sz w:val="20"/>
-                <w:szCs w:val="20"/>
-              </w:rPr>
-              <w:t xml:space="preserve">200 T€</w:t>
-            </w:r>
-          </w:p>
-        </w:tc>
-        <w:tc>
-          <w:tcPr>
-            <w:tcW w:type="dxa" w:w="4200"/>
-            <w:tcBorders>
-              <w:top w:val="single" w:color="EAE3D4" w:sz="6"/>
-              <w:left w:val="single" w:color="EAE3D4" w:sz="6"/>
-              <w:bottom w:val="single" w:color="EAE3D4" w:sz="6"/>
-              <w:right w:val="single" w:color="EAE3D4" w:sz="6"/>
-            </w:tcBorders>
-            <w:tcMar>
-              <w:top w:type="dxa" w:w="120"/>
-              <w:left w:type="dxa" w:w="160"/>
-              <w:bottom w:type="dxa" w:w="120"/>
-              <w:right w:type="dxa" w:w="160"/>
-            </w:tcMar>
-            <w:vAlign w:val="center"/>
-          </w:tcPr>
-          <w:p>
-            <w:pPr>
-              <w:jc w:val="right"/>
-            </w:pPr>
-            <w:r>
-              <w:rPr>
-                <w:rFonts w:ascii="Calibri" w:cs="Calibri" w:eastAsia="Calibri" w:hAnsi="Calibri"/>
-                <w:b w:val="false"/>
-                <w:bCs w:val="false"/>
-                <w:color w:val="1A1612"/>
-                <w:sz w:val="20"/>
-                <w:szCs w:val="20"/>
-              </w:rPr>
-              <w:t xml:space="preserve">Köln-Launch Q1/2027, Düsseldorf-Launch Q3/2027</w:t>
+              <w:t xml:space="preserve">Marketing &amp; Vertrieb</w:t>
+            </w:r>
+          </w:p>
+        </w:tc>
+        <w:tc>
+          <w:tcPr>
+            <w:tcW w:type="dxa" w:w="900"/>
+            <w:tcBorders>
+              <w:top w:val="single" w:color="EAE3D4" w:sz="6"/>
+              <w:left w:val="single" w:color="EAE3D4" w:sz="6"/>
+              <w:bottom w:val="single" w:color="EAE3D4" w:sz="6"/>
+              <w:right w:val="single" w:color="EAE3D4" w:sz="6"/>
+            </w:tcBorders>
+            <w:tcMar>
+              <w:top w:type="dxa" w:w="120"/>
+              <w:left w:type="dxa" w:w="160"/>
+              <w:bottom w:type="dxa" w:w="120"/>
+              <w:right w:type="dxa" w:w="160"/>
+            </w:tcMar>
+            <w:vAlign w:val="center"/>
+          </w:tcPr>
+          <w:p>
+            <w:pPr>
+              <w:jc w:val="right"/>
+            </w:pPr>
+            <w:r>
+              <w:rPr>
+                <w:rFonts w:ascii="Calibri" w:cs="Calibri" w:eastAsia="Calibri" w:hAnsi="Calibri"/>
+                <w:b w:val="false"/>
+                <w:bCs w:val="false"/>
+                <w:color w:val="1A1612"/>
+                <w:sz w:val="20"/>
+                <w:szCs w:val="20"/>
+              </w:rPr>
+              <w:t xml:space="preserve">22 %</w:t>
+            </w:r>
+          </w:p>
+        </w:tc>
+        <w:tc>
+          <w:tcPr>
+            <w:tcW w:type="dxa" w:w="1100"/>
+            <w:tcBorders>
+              <w:top w:val="single" w:color="EAE3D4" w:sz="6"/>
+              <w:left w:val="single" w:color="EAE3D4" w:sz="6"/>
+              <w:bottom w:val="single" w:color="EAE3D4" w:sz="6"/>
+              <w:right w:val="single" w:color="EAE3D4" w:sz="6"/>
+            </w:tcBorders>
+            <w:tcMar>
+              <w:top w:type="dxa" w:w="120"/>
+              <w:left w:type="dxa" w:w="160"/>
+              <w:bottom w:type="dxa" w:w="120"/>
+              <w:right w:type="dxa" w:w="160"/>
+            </w:tcMar>
+            <w:vAlign w:val="center"/>
+          </w:tcPr>
+          <w:p>
+            <w:pPr>
+              <w:jc w:val="right"/>
+            </w:pPr>
+            <w:r>
+              <w:rPr>
+                <w:rFonts w:ascii="Calibri" w:cs="Calibri" w:eastAsia="Calibri" w:hAnsi="Calibri"/>
+                <w:b w:val="false"/>
+                <w:bCs w:val="false"/>
+                <w:color w:val="1A1612"/>
+                <w:sz w:val="20"/>
+                <w:szCs w:val="20"/>
+              </w:rPr>
+              <w:t xml:space="preserve">220 T€</w:t>
+            </w:r>
+          </w:p>
+        </w:tc>
+        <w:tc>
+          <w:tcPr>
+            <w:tcW w:type="dxa" w:w="3800"/>
+            <w:tcBorders>
+              <w:top w:val="single" w:color="EAE3D4" w:sz="6"/>
+              <w:left w:val="single" w:color="EAE3D4" w:sz="6"/>
+              <w:bottom w:val="single" w:color="EAE3D4" w:sz="6"/>
+              <w:right w:val="single" w:color="EAE3D4" w:sz="6"/>
+            </w:tcBorders>
+            <w:tcMar>
+              <w:top w:type="dxa" w:w="120"/>
+              <w:left w:type="dxa" w:w="160"/>
+              <w:bottom w:type="dxa" w:w="120"/>
+              <w:right w:type="dxa" w:w="160"/>
+            </w:tcMar>
+            <w:vAlign w:val="center"/>
+          </w:tcPr>
+          <w:p>
+            <w:pPr>
+              <w:jc w:val="right"/>
+            </w:pPr>
+            <w:r>
+              <w:rPr>
+                <w:rFonts w:ascii="Calibri" w:cs="Calibri" w:eastAsia="Calibri" w:hAnsi="Calibri"/>
+                <w:b w:val="false"/>
+                <w:bCs w:val="false"/>
+                <w:color w:val="1A1612"/>
+                <w:sz w:val="20"/>
+                <w:szCs w:val="20"/>
+              </w:rPr>
+              <w:t xml:space="preserve">Paid Social, SEO, Apotheken-Kooperationen, PR-Events, Content</w:t>
             </w:r>
           </w:p>
         </w:tc>
@@ -12146,7 +12146,7 @@
       <w:tr>
         <w:tc>
           <w:tcPr>
-            <w:tcW w:type="dxa" w:w="2400"/>
+            <w:tcW w:type="dxa" w:w="3400"/>
             <w:tcBorders>
               <w:top w:val="single" w:color="EAE3D4" w:sz="6"/>
               <w:left w:val="single" w:color="EAE3D4" w:sz="6"/>
@@ -12175,13 +12175,13 @@
                 <w:sz w:val="20"/>
                 <w:szCs w:val="20"/>
               </w:rPr>
-              <w:t xml:space="preserve">Technologie &amp; Infrastruktur</w:t>
-            </w:r>
-          </w:p>
-        </w:tc>
-        <w:tc>
-          <w:tcPr>
-            <w:tcW w:type="dxa" w:w="1200"/>
+              <w:t xml:space="preserve">Geografische Expansion</w:t>
+            </w:r>
+          </w:p>
+        </w:tc>
+        <w:tc>
+          <w:tcPr>
+            <w:tcW w:type="dxa" w:w="900"/>
             <w:tcBorders>
               <w:top w:val="single" w:color="EAE3D4" w:sz="6"/>
               <w:left w:val="single" w:color="EAE3D4" w:sz="6"/>
@@ -12210,13 +12210,13 @@
                 <w:sz w:val="20"/>
                 <w:szCs w:val="20"/>
               </w:rPr>
-              <w:t xml:space="preserve">10 %</w:t>
-            </w:r>
-          </w:p>
-        </w:tc>
-        <w:tc>
-          <w:tcPr>
-            <w:tcW w:type="dxa" w:w="1200"/>
+              <w:t xml:space="preserve">11 %</w:t>
+            </w:r>
+          </w:p>
+        </w:tc>
+        <w:tc>
+          <w:tcPr>
+            <w:tcW w:type="dxa" w:w="1100"/>
             <w:tcBorders>
               <w:top w:val="single" w:color="EAE3D4" w:sz="6"/>
               <w:left w:val="single" w:color="EAE3D4" w:sz="6"/>
@@ -12245,13 +12245,13 @@
                 <w:sz w:val="20"/>
                 <w:szCs w:val="20"/>
               </w:rPr>
-              <w:t xml:space="preserve">100 T€</w:t>
-            </w:r>
-          </w:p>
-        </w:tc>
-        <w:tc>
-          <w:tcPr>
-            <w:tcW w:type="dxa" w:w="4200"/>
+              <w:t xml:space="preserve">110 T€</w:t>
+            </w:r>
+          </w:p>
+        </w:tc>
+        <w:tc>
+          <w:tcPr>
+            <w:tcW w:type="dxa" w:w="3800"/>
             <w:tcBorders>
               <w:top w:val="single" w:color="EAE3D4" w:sz="6"/>
               <w:left w:val="single" w:color="EAE3D4" w:sz="6"/>
@@ -12280,7 +12280,7 @@
                 <w:sz w:val="20"/>
                 <w:szCs w:val="20"/>
               </w:rPr>
-              <w:t xml:space="preserve">Engineering, Kassen-Integrationen, DSGVO-Audit</w:t>
+              <w:t xml:space="preserve">Köln-Launch Q1/2027 + Düsseldorf-Launch Q3/2027 (Setup, lokale Ops)</w:t>
             </w:r>
           </w:p>
         </w:tc>
@@ -12288,7 +12288,7 @@
       <w:tr>
         <w:tc>
           <w:tcPr>
-            <w:tcW w:type="dxa" w:w="2400"/>
+            <w:tcW w:type="dxa" w:w="3400"/>
             <w:tcBorders>
               <w:top w:val="single" w:color="EAE3D4" w:sz="6"/>
               <w:left w:val="single" w:color="EAE3D4" w:sz="6"/>
@@ -12316,19 +12316,719 @@
                 <w:sz w:val="20"/>
                 <w:szCs w:val="20"/>
               </w:rPr>
+              <w:t xml:space="preserve">Technologie &amp; Infrastruktur</w:t>
+            </w:r>
+          </w:p>
+        </w:tc>
+        <w:tc>
+          <w:tcPr>
+            <w:tcW w:type="dxa" w:w="900"/>
+            <w:tcBorders>
+              <w:top w:val="single" w:color="EAE3D4" w:sz="6"/>
+              <w:left w:val="single" w:color="EAE3D4" w:sz="6"/>
+              <w:bottom w:val="single" w:color="EAE3D4" w:sz="6"/>
+              <w:right w:val="single" w:color="EAE3D4" w:sz="6"/>
+            </w:tcBorders>
+            <w:tcMar>
+              <w:top w:type="dxa" w:w="120"/>
+              <w:left w:type="dxa" w:w="160"/>
+              <w:bottom w:type="dxa" w:w="120"/>
+              <w:right w:type="dxa" w:w="160"/>
+            </w:tcMar>
+            <w:vAlign w:val="center"/>
+          </w:tcPr>
+          <w:p>
+            <w:pPr>
+              <w:jc w:val="right"/>
+            </w:pPr>
+            <w:r>
+              <w:rPr>
+                <w:rFonts w:ascii="Calibri" w:cs="Calibri" w:eastAsia="Calibri" w:hAnsi="Calibri"/>
+                <w:b w:val="false"/>
+                <w:bCs w:val="false"/>
+                <w:color w:val="1A1612"/>
+                <w:sz w:val="20"/>
+                <w:szCs w:val="20"/>
+              </w:rPr>
+              <w:t xml:space="preserve">6 %</w:t>
+            </w:r>
+          </w:p>
+        </w:tc>
+        <w:tc>
+          <w:tcPr>
+            <w:tcW w:type="dxa" w:w="1100"/>
+            <w:tcBorders>
+              <w:top w:val="single" w:color="EAE3D4" w:sz="6"/>
+              <w:left w:val="single" w:color="EAE3D4" w:sz="6"/>
+              <w:bottom w:val="single" w:color="EAE3D4" w:sz="6"/>
+              <w:right w:val="single" w:color="EAE3D4" w:sz="6"/>
+            </w:tcBorders>
+            <w:tcMar>
+              <w:top w:type="dxa" w:w="120"/>
+              <w:left w:type="dxa" w:w="160"/>
+              <w:bottom w:type="dxa" w:w="120"/>
+              <w:right w:type="dxa" w:w="160"/>
+            </w:tcMar>
+            <w:vAlign w:val="center"/>
+          </w:tcPr>
+          <w:p>
+            <w:pPr>
+              <w:jc w:val="right"/>
+            </w:pPr>
+            <w:r>
+              <w:rPr>
+                <w:rFonts w:ascii="Calibri" w:cs="Calibri" w:eastAsia="Calibri" w:hAnsi="Calibri"/>
+                <w:b w:val="false"/>
+                <w:bCs w:val="false"/>
+                <w:color w:val="1A1612"/>
+                <w:sz w:val="20"/>
+                <w:szCs w:val="20"/>
+              </w:rPr>
+              <w:t xml:space="preserve">60 T€</w:t>
+            </w:r>
+          </w:p>
+        </w:tc>
+        <w:tc>
+          <w:tcPr>
+            <w:tcW w:type="dxa" w:w="3800"/>
+            <w:tcBorders>
+              <w:top w:val="single" w:color="EAE3D4" w:sz="6"/>
+              <w:left w:val="single" w:color="EAE3D4" w:sz="6"/>
+              <w:bottom w:val="single" w:color="EAE3D4" w:sz="6"/>
+              <w:right w:val="single" w:color="EAE3D4" w:sz="6"/>
+            </w:tcBorders>
+            <w:tcMar>
+              <w:top w:type="dxa" w:w="120"/>
+              <w:left w:type="dxa" w:w="160"/>
+              <w:bottom w:type="dxa" w:w="120"/>
+              <w:right w:type="dxa" w:w="160"/>
+            </w:tcMar>
+            <w:vAlign w:val="center"/>
+          </w:tcPr>
+          <w:p>
+            <w:pPr>
+              <w:jc w:val="right"/>
+            </w:pPr>
+            <w:r>
+              <w:rPr>
+                <w:rFonts w:ascii="Calibri" w:cs="Calibri" w:eastAsia="Calibri" w:hAnsi="Calibri"/>
+                <w:b w:val="false"/>
+                <w:bCs w:val="false"/>
+                <w:color w:val="1A1612"/>
+                <w:sz w:val="20"/>
+                <w:szCs w:val="20"/>
+              </w:rPr>
+              <w:t xml:space="preserve">Hosting (Vercel/Supabase), Kassen-APIs, DSGVO-Audit, Sentry</w:t>
+            </w:r>
+          </w:p>
+        </w:tc>
+      </w:tr>
+      <w:tr>
+        <w:tc>
+          <w:tcPr>
+            <w:tcW w:type="dxa" w:w="3400"/>
+            <w:tcBorders>
+              <w:top w:val="single" w:color="EAE3D4" w:sz="6"/>
+              <w:left w:val="single" w:color="EAE3D4" w:sz="6"/>
+              <w:bottom w:val="single" w:color="EAE3D4" w:sz="6"/>
+              <w:right w:val="single" w:color="EAE3D4" w:sz="6"/>
+            </w:tcBorders>
+            <w:shd w:fill="FAF7F1" w:val="clear"/>
+            <w:tcMar>
+              <w:top w:type="dxa" w:w="120"/>
+              <w:left w:type="dxa" w:w="160"/>
+              <w:bottom w:type="dxa" w:w="120"/>
+              <w:right w:type="dxa" w:w="160"/>
+            </w:tcMar>
+            <w:vAlign w:val="center"/>
+          </w:tcPr>
+          <w:p>
+            <w:pPr>
+              <w:jc w:val="left"/>
+            </w:pPr>
+            <w:r>
+              <w:rPr>
+                <w:rFonts w:ascii="Calibri" w:cs="Calibri" w:eastAsia="Calibri" w:hAnsi="Calibri"/>
+                <w:b w:val="false"/>
+                <w:bCs w:val="false"/>
+                <w:color w:val="1A1612"/>
+                <w:sz w:val="20"/>
+                <w:szCs w:val="20"/>
+              </w:rPr>
+              <w:t xml:space="preserve">Recht, Notar, Versicherung, Buchhaltung</w:t>
+            </w:r>
+          </w:p>
+        </w:tc>
+        <w:tc>
+          <w:tcPr>
+            <w:tcW w:type="dxa" w:w="900"/>
+            <w:tcBorders>
+              <w:top w:val="single" w:color="EAE3D4" w:sz="6"/>
+              <w:left w:val="single" w:color="EAE3D4" w:sz="6"/>
+              <w:bottom w:val="single" w:color="EAE3D4" w:sz="6"/>
+              <w:right w:val="single" w:color="EAE3D4" w:sz="6"/>
+            </w:tcBorders>
+            <w:shd w:fill="FAF7F1" w:val="clear"/>
+            <w:tcMar>
+              <w:top w:type="dxa" w:w="120"/>
+              <w:left w:type="dxa" w:w="160"/>
+              <w:bottom w:type="dxa" w:w="120"/>
+              <w:right w:type="dxa" w:w="160"/>
+            </w:tcMar>
+            <w:vAlign w:val="center"/>
+          </w:tcPr>
+          <w:p>
+            <w:pPr>
+              <w:jc w:val="right"/>
+            </w:pPr>
+            <w:r>
+              <w:rPr>
+                <w:rFonts w:ascii="Calibri" w:cs="Calibri" w:eastAsia="Calibri" w:hAnsi="Calibri"/>
+                <w:b w:val="false"/>
+                <w:bCs w:val="false"/>
+                <w:color w:val="1A1612"/>
+                <w:sz w:val="20"/>
+                <w:szCs w:val="20"/>
+              </w:rPr>
+              <w:t xml:space="preserve">3,2 %</w:t>
+            </w:r>
+          </w:p>
+        </w:tc>
+        <w:tc>
+          <w:tcPr>
+            <w:tcW w:type="dxa" w:w="1100"/>
+            <w:tcBorders>
+              <w:top w:val="single" w:color="EAE3D4" w:sz="6"/>
+              <w:left w:val="single" w:color="EAE3D4" w:sz="6"/>
+              <w:bottom w:val="single" w:color="EAE3D4" w:sz="6"/>
+              <w:right w:val="single" w:color="EAE3D4" w:sz="6"/>
+            </w:tcBorders>
+            <w:shd w:fill="FAF7F1" w:val="clear"/>
+            <w:tcMar>
+              <w:top w:type="dxa" w:w="120"/>
+              <w:left w:type="dxa" w:w="160"/>
+              <w:bottom w:type="dxa" w:w="120"/>
+              <w:right w:type="dxa" w:w="160"/>
+            </w:tcMar>
+            <w:vAlign w:val="center"/>
+          </w:tcPr>
+          <w:p>
+            <w:pPr>
+              <w:jc w:val="right"/>
+            </w:pPr>
+            <w:r>
+              <w:rPr>
+                <w:rFonts w:ascii="Calibri" w:cs="Calibri" w:eastAsia="Calibri" w:hAnsi="Calibri"/>
+                <w:b w:val="false"/>
+                <w:bCs w:val="false"/>
+                <w:color w:val="1A1612"/>
+                <w:sz w:val="20"/>
+                <w:szCs w:val="20"/>
+              </w:rPr>
+              <w:t xml:space="preserve">32 T€</w:t>
+            </w:r>
+          </w:p>
+        </w:tc>
+        <w:tc>
+          <w:tcPr>
+            <w:tcW w:type="dxa" w:w="3800"/>
+            <w:tcBorders>
+              <w:top w:val="single" w:color="EAE3D4" w:sz="6"/>
+              <w:left w:val="single" w:color="EAE3D4" w:sz="6"/>
+              <w:bottom w:val="single" w:color="EAE3D4" w:sz="6"/>
+              <w:right w:val="single" w:color="EAE3D4" w:sz="6"/>
+            </w:tcBorders>
+            <w:shd w:fill="FAF7F1" w:val="clear"/>
+            <w:tcMar>
+              <w:top w:type="dxa" w:w="120"/>
+              <w:left w:type="dxa" w:w="160"/>
+              <w:bottom w:type="dxa" w:w="120"/>
+              <w:right w:type="dxa" w:w="160"/>
+            </w:tcMar>
+            <w:vAlign w:val="center"/>
+          </w:tcPr>
+          <w:p>
+            <w:pPr>
+              <w:jc w:val="right"/>
+            </w:pPr>
+            <w:r>
+              <w:rPr>
+                <w:rFonts w:ascii="Calibri" w:cs="Calibri" w:eastAsia="Calibri" w:hAnsi="Calibri"/>
+                <w:b w:val="false"/>
+                <w:bCs w:val="false"/>
+                <w:color w:val="1A1612"/>
+                <w:sz w:val="20"/>
+                <w:szCs w:val="20"/>
+              </w:rPr>
+              <w:t xml:space="preserve">GmbH-Umwandlung, D&amp;O-Police, Betriebshaftpflicht, Steuerberater</w:t>
+            </w:r>
+          </w:p>
+        </w:tc>
+      </w:tr>
+      <w:tr>
+        <w:tc>
+          <w:tcPr>
+            <w:tcW w:type="dxa" w:w="3400"/>
+            <w:tcBorders>
+              <w:top w:val="single" w:color="EAE3D4" w:sz="6"/>
+              <w:left w:val="single" w:color="EAE3D4" w:sz="6"/>
+              <w:bottom w:val="single" w:color="EAE3D4" w:sz="6"/>
+              <w:right w:val="single" w:color="EAE3D4" w:sz="6"/>
+            </w:tcBorders>
+            <w:tcMar>
+              <w:top w:type="dxa" w:w="120"/>
+              <w:left w:type="dxa" w:w="160"/>
+              <w:bottom w:type="dxa" w:w="120"/>
+              <w:right w:type="dxa" w:w="160"/>
+            </w:tcMar>
+            <w:vAlign w:val="center"/>
+          </w:tcPr>
+          <w:p>
+            <w:pPr>
+              <w:jc w:val="left"/>
+            </w:pPr>
+            <w:r>
+              <w:rPr>
+                <w:rFonts w:ascii="Calibri" w:cs="Calibri" w:eastAsia="Calibri" w:hAnsi="Calibri"/>
+                <w:b w:val="false"/>
+                <w:bCs w:val="false"/>
+                <w:color w:val="1A1612"/>
+                <w:sz w:val="20"/>
+                <w:szCs w:val="20"/>
+              </w:rPr>
+              <w:t xml:space="preserve">Büro &amp; Co-Working</w:t>
+            </w:r>
+          </w:p>
+        </w:tc>
+        <w:tc>
+          <w:tcPr>
+            <w:tcW w:type="dxa" w:w="900"/>
+            <w:tcBorders>
+              <w:top w:val="single" w:color="EAE3D4" w:sz="6"/>
+              <w:left w:val="single" w:color="EAE3D4" w:sz="6"/>
+              <w:bottom w:val="single" w:color="EAE3D4" w:sz="6"/>
+              <w:right w:val="single" w:color="EAE3D4" w:sz="6"/>
+            </w:tcBorders>
+            <w:tcMar>
+              <w:top w:type="dxa" w:w="120"/>
+              <w:left w:type="dxa" w:w="160"/>
+              <w:bottom w:type="dxa" w:w="120"/>
+              <w:right w:type="dxa" w:w="160"/>
+            </w:tcMar>
+            <w:vAlign w:val="center"/>
+          </w:tcPr>
+          <w:p>
+            <w:pPr>
+              <w:jc w:val="right"/>
+            </w:pPr>
+            <w:r>
+              <w:rPr>
+                <w:rFonts w:ascii="Calibri" w:cs="Calibri" w:eastAsia="Calibri" w:hAnsi="Calibri"/>
+                <w:b w:val="false"/>
+                <w:bCs w:val="false"/>
+                <w:color w:val="1A1612"/>
+                <w:sz w:val="20"/>
+                <w:szCs w:val="20"/>
+              </w:rPr>
+              <w:t xml:space="preserve">2,2 %</w:t>
+            </w:r>
+          </w:p>
+        </w:tc>
+        <w:tc>
+          <w:tcPr>
+            <w:tcW w:type="dxa" w:w="1100"/>
+            <w:tcBorders>
+              <w:top w:val="single" w:color="EAE3D4" w:sz="6"/>
+              <w:left w:val="single" w:color="EAE3D4" w:sz="6"/>
+              <w:bottom w:val="single" w:color="EAE3D4" w:sz="6"/>
+              <w:right w:val="single" w:color="EAE3D4" w:sz="6"/>
+            </w:tcBorders>
+            <w:tcMar>
+              <w:top w:type="dxa" w:w="120"/>
+              <w:left w:type="dxa" w:w="160"/>
+              <w:bottom w:type="dxa" w:w="120"/>
+              <w:right w:type="dxa" w:w="160"/>
+            </w:tcMar>
+            <w:vAlign w:val="center"/>
+          </w:tcPr>
+          <w:p>
+            <w:pPr>
+              <w:jc w:val="right"/>
+            </w:pPr>
+            <w:r>
+              <w:rPr>
+                <w:rFonts w:ascii="Calibri" w:cs="Calibri" w:eastAsia="Calibri" w:hAnsi="Calibri"/>
+                <w:b w:val="false"/>
+                <w:bCs w:val="false"/>
+                <w:color w:val="1A1612"/>
+                <w:sz w:val="20"/>
+                <w:szCs w:val="20"/>
+              </w:rPr>
+              <w:t xml:space="preserve">22 T€</w:t>
+            </w:r>
+          </w:p>
+        </w:tc>
+        <w:tc>
+          <w:tcPr>
+            <w:tcW w:type="dxa" w:w="3800"/>
+            <w:tcBorders>
+              <w:top w:val="single" w:color="EAE3D4" w:sz="6"/>
+              <w:left w:val="single" w:color="EAE3D4" w:sz="6"/>
+              <w:bottom w:val="single" w:color="EAE3D4" w:sz="6"/>
+              <w:right w:val="single" w:color="EAE3D4" w:sz="6"/>
+            </w:tcBorders>
+            <w:tcMar>
+              <w:top w:type="dxa" w:w="120"/>
+              <w:left w:type="dxa" w:w="160"/>
+              <w:bottom w:type="dxa" w:w="120"/>
+              <w:right w:type="dxa" w:w="160"/>
+            </w:tcMar>
+            <w:vAlign w:val="center"/>
+          </w:tcPr>
+          <w:p>
+            <w:pPr>
+              <w:jc w:val="right"/>
+            </w:pPr>
+            <w:r>
+              <w:rPr>
+                <w:rFonts w:ascii="Calibri" w:cs="Calibri" w:eastAsia="Calibri" w:hAnsi="Calibri"/>
+                <w:b w:val="false"/>
+                <w:bCs w:val="false"/>
+                <w:color w:val="1A1612"/>
+                <w:sz w:val="20"/>
+                <w:szCs w:val="20"/>
+              </w:rPr>
+              <w:t xml:space="preserve">WeWork/Mindspace FFM + Satellit Köln/Düsseldorf</w:t>
+            </w:r>
+          </w:p>
+        </w:tc>
+      </w:tr>
+      <w:tr>
+        <w:tc>
+          <w:tcPr>
+            <w:tcW w:type="dxa" w:w="3400"/>
+            <w:tcBorders>
+              <w:top w:val="single" w:color="EAE3D4" w:sz="6"/>
+              <w:left w:val="single" w:color="EAE3D4" w:sz="6"/>
+              <w:bottom w:val="single" w:color="EAE3D4" w:sz="6"/>
+              <w:right w:val="single" w:color="EAE3D4" w:sz="6"/>
+            </w:tcBorders>
+            <w:shd w:fill="FAF7F1" w:val="clear"/>
+            <w:tcMar>
+              <w:top w:type="dxa" w:w="120"/>
+              <w:left w:type="dxa" w:w="160"/>
+              <w:bottom w:type="dxa" w:w="120"/>
+              <w:right w:type="dxa" w:w="160"/>
+            </w:tcMar>
+            <w:vAlign w:val="center"/>
+          </w:tcPr>
+          <w:p>
+            <w:pPr>
+              <w:jc w:val="left"/>
+            </w:pPr>
+            <w:r>
+              <w:rPr>
+                <w:rFonts w:ascii="Calibri" w:cs="Calibri" w:eastAsia="Calibri" w:hAnsi="Calibri"/>
+                <w:b w:val="false"/>
+                <w:bCs w:val="false"/>
+                <w:color w:val="1A1612"/>
+                <w:sz w:val="20"/>
+                <w:szCs w:val="20"/>
+              </w:rPr>
+              <w:t xml:space="preserve">Firmenwagen</w:t>
+            </w:r>
+          </w:p>
+        </w:tc>
+        <w:tc>
+          <w:tcPr>
+            <w:tcW w:type="dxa" w:w="900"/>
+            <w:tcBorders>
+              <w:top w:val="single" w:color="EAE3D4" w:sz="6"/>
+              <w:left w:val="single" w:color="EAE3D4" w:sz="6"/>
+              <w:bottom w:val="single" w:color="EAE3D4" w:sz="6"/>
+              <w:right w:val="single" w:color="EAE3D4" w:sz="6"/>
+            </w:tcBorders>
+            <w:shd w:fill="FAF7F1" w:val="clear"/>
+            <w:tcMar>
+              <w:top w:type="dxa" w:w="120"/>
+              <w:left w:type="dxa" w:w="160"/>
+              <w:bottom w:type="dxa" w:w="120"/>
+              <w:right w:type="dxa" w:w="160"/>
+            </w:tcMar>
+            <w:vAlign w:val="center"/>
+          </w:tcPr>
+          <w:p>
+            <w:pPr>
+              <w:jc w:val="right"/>
+            </w:pPr>
+            <w:r>
+              <w:rPr>
+                <w:rFonts w:ascii="Calibri" w:cs="Calibri" w:eastAsia="Calibri" w:hAnsi="Calibri"/>
+                <w:b w:val="false"/>
+                <w:bCs w:val="false"/>
+                <w:color w:val="1A1612"/>
+                <w:sz w:val="20"/>
+                <w:szCs w:val="20"/>
+              </w:rPr>
+              <w:t xml:space="preserve">1,8 %</w:t>
+            </w:r>
+          </w:p>
+        </w:tc>
+        <w:tc>
+          <w:tcPr>
+            <w:tcW w:type="dxa" w:w="1100"/>
+            <w:tcBorders>
+              <w:top w:val="single" w:color="EAE3D4" w:sz="6"/>
+              <w:left w:val="single" w:color="EAE3D4" w:sz="6"/>
+              <w:bottom w:val="single" w:color="EAE3D4" w:sz="6"/>
+              <w:right w:val="single" w:color="EAE3D4" w:sz="6"/>
+            </w:tcBorders>
+            <w:shd w:fill="FAF7F1" w:val="clear"/>
+            <w:tcMar>
+              <w:top w:type="dxa" w:w="120"/>
+              <w:left w:type="dxa" w:w="160"/>
+              <w:bottom w:type="dxa" w:w="120"/>
+              <w:right w:type="dxa" w:w="160"/>
+            </w:tcMar>
+            <w:vAlign w:val="center"/>
+          </w:tcPr>
+          <w:p>
+            <w:pPr>
+              <w:jc w:val="right"/>
+            </w:pPr>
+            <w:r>
+              <w:rPr>
+                <w:rFonts w:ascii="Calibri" w:cs="Calibri" w:eastAsia="Calibri" w:hAnsi="Calibri"/>
+                <w:b w:val="false"/>
+                <w:bCs w:val="false"/>
+                <w:color w:val="1A1612"/>
+                <w:sz w:val="20"/>
+                <w:szCs w:val="20"/>
+              </w:rPr>
+              <w:t xml:space="preserve">18 T€</w:t>
+            </w:r>
+          </w:p>
+        </w:tc>
+        <w:tc>
+          <w:tcPr>
+            <w:tcW w:type="dxa" w:w="3800"/>
+            <w:tcBorders>
+              <w:top w:val="single" w:color="EAE3D4" w:sz="6"/>
+              <w:left w:val="single" w:color="EAE3D4" w:sz="6"/>
+              <w:bottom w:val="single" w:color="EAE3D4" w:sz="6"/>
+              <w:right w:val="single" w:color="EAE3D4" w:sz="6"/>
+            </w:tcBorders>
+            <w:shd w:fill="FAF7F1" w:val="clear"/>
+            <w:tcMar>
+              <w:top w:type="dxa" w:w="120"/>
+              <w:left w:type="dxa" w:w="160"/>
+              <w:bottom w:type="dxa" w:w="120"/>
+              <w:right w:type="dxa" w:w="160"/>
+            </w:tcMar>
+            <w:vAlign w:val="center"/>
+          </w:tcPr>
+          <w:p>
+            <w:pPr>
+              <w:jc w:val="right"/>
+            </w:pPr>
+            <w:r>
+              <w:rPr>
+                <w:rFonts w:ascii="Calibri" w:cs="Calibri" w:eastAsia="Calibri" w:hAnsi="Calibri"/>
+                <w:b w:val="false"/>
+                <w:bCs w:val="false"/>
+                <w:color w:val="1A1612"/>
+                <w:sz w:val="20"/>
+                <w:szCs w:val="20"/>
+              </w:rPr>
+              <w:t xml:space="preserve">Leasing Mittelklasse + Versicherung + Sprit (3-Städte-Betreuung)</w:t>
+            </w:r>
+          </w:p>
+        </w:tc>
+      </w:tr>
+      <w:tr>
+        <w:tc>
+          <w:tcPr>
+            <w:tcW w:type="dxa" w:w="3400"/>
+            <w:tcBorders>
+              <w:top w:val="single" w:color="EAE3D4" w:sz="6"/>
+              <w:left w:val="single" w:color="EAE3D4" w:sz="6"/>
+              <w:bottom w:val="single" w:color="EAE3D4" w:sz="6"/>
+              <w:right w:val="single" w:color="EAE3D4" w:sz="6"/>
+            </w:tcBorders>
+            <w:tcMar>
+              <w:top w:type="dxa" w:w="120"/>
+              <w:left w:type="dxa" w:w="160"/>
+              <w:bottom w:type="dxa" w:w="120"/>
+              <w:right w:type="dxa" w:w="160"/>
+            </w:tcMar>
+            <w:vAlign w:val="center"/>
+          </w:tcPr>
+          <w:p>
+            <w:pPr>
+              <w:jc w:val="left"/>
+            </w:pPr>
+            <w:r>
+              <w:rPr>
+                <w:rFonts w:ascii="Calibri" w:cs="Calibri" w:eastAsia="Calibri" w:hAnsi="Calibri"/>
+                <w:b w:val="false"/>
+                <w:bCs w:val="false"/>
+                <w:color w:val="1A1612"/>
+                <w:sz w:val="20"/>
+                <w:szCs w:val="20"/>
+              </w:rPr>
+              <w:t xml:space="preserve">Puffer (Unvorhergesehenes)</w:t>
+            </w:r>
+          </w:p>
+        </w:tc>
+        <w:tc>
+          <w:tcPr>
+            <w:tcW w:type="dxa" w:w="900"/>
+            <w:tcBorders>
+              <w:top w:val="single" w:color="EAE3D4" w:sz="6"/>
+              <w:left w:val="single" w:color="EAE3D4" w:sz="6"/>
+              <w:bottom w:val="single" w:color="EAE3D4" w:sz="6"/>
+              <w:right w:val="single" w:color="EAE3D4" w:sz="6"/>
+            </w:tcBorders>
+            <w:tcMar>
+              <w:top w:type="dxa" w:w="120"/>
+              <w:left w:type="dxa" w:w="160"/>
+              <w:bottom w:type="dxa" w:w="120"/>
+              <w:right w:type="dxa" w:w="160"/>
+            </w:tcMar>
+            <w:vAlign w:val="center"/>
+          </w:tcPr>
+          <w:p>
+            <w:pPr>
+              <w:jc w:val="right"/>
+            </w:pPr>
+            <w:r>
+              <w:rPr>
+                <w:rFonts w:ascii="Calibri" w:cs="Calibri" w:eastAsia="Calibri" w:hAnsi="Calibri"/>
+                <w:b w:val="false"/>
+                <w:bCs w:val="false"/>
+                <w:color w:val="1A1612"/>
+                <w:sz w:val="20"/>
+                <w:szCs w:val="20"/>
+              </w:rPr>
+              <w:t xml:space="preserve">5 %</w:t>
+            </w:r>
+          </w:p>
+        </w:tc>
+        <w:tc>
+          <w:tcPr>
+            <w:tcW w:type="dxa" w:w="1100"/>
+            <w:tcBorders>
+              <w:top w:val="single" w:color="EAE3D4" w:sz="6"/>
+              <w:left w:val="single" w:color="EAE3D4" w:sz="6"/>
+              <w:bottom w:val="single" w:color="EAE3D4" w:sz="6"/>
+              <w:right w:val="single" w:color="EAE3D4" w:sz="6"/>
+            </w:tcBorders>
+            <w:tcMar>
+              <w:top w:type="dxa" w:w="120"/>
+              <w:left w:type="dxa" w:w="160"/>
+              <w:bottom w:type="dxa" w:w="120"/>
+              <w:right w:type="dxa" w:w="160"/>
+            </w:tcMar>
+            <w:vAlign w:val="center"/>
+          </w:tcPr>
+          <w:p>
+            <w:pPr>
+              <w:jc w:val="right"/>
+            </w:pPr>
+            <w:r>
+              <w:rPr>
+                <w:rFonts w:ascii="Calibri" w:cs="Calibri" w:eastAsia="Calibri" w:hAnsi="Calibri"/>
+                <w:b w:val="false"/>
+                <w:bCs w:val="false"/>
+                <w:color w:val="1A1612"/>
+                <w:sz w:val="20"/>
+                <w:szCs w:val="20"/>
+              </w:rPr>
+              <w:t xml:space="preserve">50 T€</w:t>
+            </w:r>
+          </w:p>
+        </w:tc>
+        <w:tc>
+          <w:tcPr>
+            <w:tcW w:type="dxa" w:w="3800"/>
+            <w:tcBorders>
+              <w:top w:val="single" w:color="EAE3D4" w:sz="6"/>
+              <w:left w:val="single" w:color="EAE3D4" w:sz="6"/>
+              <w:bottom w:val="single" w:color="EAE3D4" w:sz="6"/>
+              <w:right w:val="single" w:color="EAE3D4" w:sz="6"/>
+            </w:tcBorders>
+            <w:tcMar>
+              <w:top w:type="dxa" w:w="120"/>
+              <w:left w:type="dxa" w:w="160"/>
+              <w:bottom w:type="dxa" w:w="120"/>
+              <w:right w:type="dxa" w:w="160"/>
+            </w:tcMar>
+            <w:vAlign w:val="center"/>
+          </w:tcPr>
+          <w:p>
+            <w:pPr>
+              <w:jc w:val="right"/>
+            </w:pPr>
+            <w:r>
+              <w:rPr>
+                <w:rFonts w:ascii="Calibri" w:cs="Calibri" w:eastAsia="Calibri" w:hAnsi="Calibri"/>
+                <w:b w:val="false"/>
+                <w:bCs w:val="false"/>
+                <w:color w:val="1A1612"/>
+                <w:sz w:val="20"/>
+                <w:szCs w:val="20"/>
+              </w:rPr>
+              <w:t xml:space="preserve">Reserve für verzögerte Hires, Kassen-Verhandlung, Sonder-Audits</w:t>
+            </w:r>
+          </w:p>
+        </w:tc>
+      </w:tr>
+      <w:tr>
+        <w:tc>
+          <w:tcPr>
+            <w:tcW w:type="dxa" w:w="3400"/>
+            <w:tcBorders>
+              <w:top w:val="single" w:color="EAE3D4" w:sz="6"/>
+              <w:left w:val="single" w:color="EAE3D4" w:sz="6"/>
+              <w:bottom w:val="single" w:color="EAE3D4" w:sz="6"/>
+              <w:right w:val="single" w:color="EAE3D4" w:sz="6"/>
+            </w:tcBorders>
+            <w:shd w:fill="FAF7F1" w:val="clear"/>
+            <w:tcMar>
+              <w:top w:type="dxa" w:w="120"/>
+              <w:left w:type="dxa" w:w="160"/>
+              <w:bottom w:type="dxa" w:w="120"/>
+              <w:right w:type="dxa" w:w="160"/>
+            </w:tcMar>
+            <w:vAlign w:val="center"/>
+          </w:tcPr>
+          <w:p>
+            <w:pPr>
+              <w:jc w:val="left"/>
+            </w:pPr>
+            <w:r>
+              <w:rPr>
+                <w:rFonts w:ascii="Calibri" w:cs="Calibri" w:eastAsia="Calibri" w:hAnsi="Calibri"/>
+                <w:b w:val="false"/>
+                <w:bCs w:val="false"/>
+                <w:color w:val="1A1612"/>
+                <w:sz w:val="20"/>
+                <w:szCs w:val="20"/>
+              </w:rPr>
               <w:t xml:space="preserve">Gesamt</w:t>
             </w:r>
           </w:p>
         </w:tc>
         <w:tc>
           <w:tcPr>
-            <w:tcW w:type="dxa" w:w="1200"/>
-            <w:tcBorders>
-              <w:top w:val="single" w:color="EAE3D4" w:sz="6"/>
-              <w:left w:val="single" w:color="EAE3D4" w:sz="6"/>
-              <w:bottom w:val="single" w:color="EAE3D4" w:sz="6"/>
-              <w:right w:val="single" w:color="EAE3D4" w:sz="6"/>
-            </w:tcBorders>
+            <w:tcW w:type="dxa" w:w="900"/>
+            <w:tcBorders>
+              <w:top w:val="single" w:color="EAE3D4" w:sz="6"/>
+              <w:left w:val="single" w:color="EAE3D4" w:sz="6"/>
+              <w:bottom w:val="single" w:color="EAE3D4" w:sz="6"/>
+              <w:right w:val="single" w:color="EAE3D4" w:sz="6"/>
+            </w:tcBorders>
+            <w:shd w:fill="FAF7F1" w:val="clear"/>
             <w:tcMar>
               <w:top w:type="dxa" w:w="120"/>
               <w:left w:type="dxa" w:w="160"/>
@@ -12356,13 +13056,14 @@
         </w:tc>
         <w:tc>
           <w:tcPr>
-            <w:tcW w:type="dxa" w:w="1200"/>
-            <w:tcBorders>
-              <w:top w:val="single" w:color="EAE3D4" w:sz="6"/>
-              <w:left w:val="single" w:color="EAE3D4" w:sz="6"/>
-              <w:bottom w:val="single" w:color="EAE3D4" w:sz="6"/>
-              <w:right w:val="single" w:color="EAE3D4" w:sz="6"/>
-            </w:tcBorders>
+            <w:tcW w:type="dxa" w:w="1100"/>
+            <w:tcBorders>
+              <w:top w:val="single" w:color="EAE3D4" w:sz="6"/>
+              <w:left w:val="single" w:color="EAE3D4" w:sz="6"/>
+              <w:bottom w:val="single" w:color="EAE3D4" w:sz="6"/>
+              <w:right w:val="single" w:color="EAE3D4" w:sz="6"/>
+            </w:tcBorders>
+            <w:shd w:fill="FAF7F1" w:val="clear"/>
             <w:tcMar>
               <w:top w:type="dxa" w:w="120"/>
               <w:left w:type="dxa" w:w="160"/>
@@ -12390,35 +13091,36 @@
         </w:tc>
         <w:tc>
           <w:tcPr>
-            <w:tcW w:type="dxa" w:w="4200"/>
-            <w:tcBorders>
-              <w:top w:val="single" w:color="EAE3D4" w:sz="6"/>
-              <w:left w:val="single" w:color="EAE3D4" w:sz="6"/>
-              <w:bottom w:val="single" w:color="EAE3D4" w:sz="6"/>
-              <w:right w:val="single" w:color="EAE3D4" w:sz="6"/>
-            </w:tcBorders>
-            <w:tcMar>
-              <w:top w:type="dxa" w:w="120"/>
-              <w:left w:type="dxa" w:w="160"/>
-              <w:bottom w:type="dxa" w:w="120"/>
-              <w:right w:type="dxa" w:w="160"/>
-            </w:tcMar>
-            <w:vAlign w:val="center"/>
-          </w:tcPr>
-          <w:p>
-            <w:pPr>
-              <w:jc w:val="right"/>
-            </w:pPr>
-            <w:r>
-              <w:rPr>
-                <w:rFonts w:ascii="Calibri" w:cs="Calibri" w:eastAsia="Calibri" w:hAnsi="Calibri"/>
-                <w:b w:val="false"/>
-                <w:bCs w:val="false"/>
-                <w:color w:val="1A1612"/>
-                <w:sz w:val="20"/>
-                <w:szCs w:val="20"/>
-              </w:rPr>
-              <w:t xml:space="preserve">Runway 18 Monate</w:t>
+            <w:tcW w:type="dxa" w:w="3800"/>
+            <w:tcBorders>
+              <w:top w:val="single" w:color="EAE3D4" w:sz="6"/>
+              <w:left w:val="single" w:color="EAE3D4" w:sz="6"/>
+              <w:bottom w:val="single" w:color="EAE3D4" w:sz="6"/>
+              <w:right w:val="single" w:color="EAE3D4" w:sz="6"/>
+            </w:tcBorders>
+            <w:shd w:fill="FAF7F1" w:val="clear"/>
+            <w:tcMar>
+              <w:top w:type="dxa" w:w="120"/>
+              <w:left w:type="dxa" w:w="160"/>
+              <w:bottom w:type="dxa" w:w="120"/>
+              <w:right w:type="dxa" w:w="160"/>
+            </w:tcMar>
+            <w:vAlign w:val="center"/>
+          </w:tcPr>
+          <w:p>
+            <w:pPr>
+              <w:jc w:val="right"/>
+            </w:pPr>
+            <w:r>
+              <w:rPr>
+                <w:rFonts w:ascii="Calibri" w:cs="Calibri" w:eastAsia="Calibri" w:hAnsi="Calibri"/>
+                <w:b w:val="false"/>
+                <w:bCs w:val="false"/>
+                <w:color w:val="1A1612"/>
+                <w:sz w:val="20"/>
+                <w:szCs w:val="20"/>
+              </w:rPr>
+              <w:t xml:space="preserve">Runway 18 Monate bis Seed-Runde Q4/2027</w:t>
             </w:r>
           </w:p>
         </w:tc>
@@ -12446,7 +13148,7 @@
           <w:sz w:val="26"/>
           <w:szCs w:val="26"/>
         </w:rPr>
-        <w:t xml:space="preserve">Runway und nächste Finanzierungs-Runde</w:t>
+        <w:t xml:space="preserve">Personal-Plan Detail (18-Monats-Staffelung)</w:t>
       </w:r>
     </w:p>
     <w:p>
@@ -12461,7 +13163,1495 @@
           <w:sz w:val="22"/>
           <w:szCs w:val="22"/>
         </w:rPr>
-        <w:t xml:space="preserve">Mit 1,0 Mio € und einer durchschnittlichen monatlichen Burn-Rate von 55 T€ (steigend von 35 T€ in Q2/2026 auf 75 T€ Ende 2027) beträgt die Laufzeit 18 Monate. Die nächste Finanzierungs-Runde (Seed, Zielvolumen 3–5 Mio €) ist für Q4/2027 geplant, sobald die drei Städte live sind und 1.500+ aktive Kunden existieren — das entspricht einer Annual Recurring Revenue von ~6 Mio €.</w:t>
+        <w:t xml:space="preserve">Die 380 T€ Team-Budget setzen sich aus fünf Positionen zusammen, gestaffelt nach Stadt-Launches und Traktion. Alle Beträge all-in inklusive Arbeitgeber-Anteil Sozialversicherung (~22 %):</w:t>
+      </w:r>
+    </w:p>
+    <w:tbl>
+      <w:tblPr>
+        <w:tblW w:type="dxa" w:w="8000"/>
+        <w:tblBorders>
+          <w:top w:val="single" w:color="auto" w:sz="4"/>
+          <w:left w:val="single" w:color="auto" w:sz="4"/>
+          <w:bottom w:val="single" w:color="auto" w:sz="4"/>
+          <w:right w:val="single" w:color="auto" w:sz="4"/>
+          <w:insideH w:val="single" w:color="auto" w:sz="4"/>
+          <w:insideV w:val="single" w:color="auto" w:sz="4"/>
+        </w:tblBorders>
+      </w:tblPr>
+      <w:tblGrid>
+        <w:gridCol w:w="2800"/>
+        <w:gridCol w:w="1200"/>
+        <w:gridCol w:w="1200"/>
+        <w:gridCol w:w="1300"/>
+        <w:gridCol w:w="1500"/>
+      </w:tblGrid>
+      <w:tr>
+        <w:tc>
+          <w:tcPr>
+            <w:tcW w:type="dxa" w:w="2800"/>
+            <w:tcBorders>
+              <w:top w:val="single" w:color="EAE3D4" w:sz="6"/>
+              <w:left w:val="single" w:color="EAE3D4" w:sz="6"/>
+              <w:bottom w:val="single" w:color="EAE3D4" w:sz="6"/>
+              <w:right w:val="single" w:color="EAE3D4" w:sz="6"/>
+            </w:tcBorders>
+            <w:shd w:fill="1A1612" w:val="clear"/>
+            <w:tcMar>
+              <w:top w:type="dxa" w:w="120"/>
+              <w:left w:type="dxa" w:w="160"/>
+              <w:bottom w:type="dxa" w:w="120"/>
+              <w:right w:type="dxa" w:w="160"/>
+            </w:tcMar>
+            <w:vAlign w:val="center"/>
+          </w:tcPr>
+          <w:p>
+            <w:pPr>
+              <w:jc w:val="left"/>
+            </w:pPr>
+            <w:r>
+              <w:rPr>
+                <w:rFonts w:ascii="Calibri" w:cs="Calibri" w:eastAsia="Calibri" w:hAnsi="Calibri"/>
+                <w:b/>
+                <w:bCs/>
+                <w:color w:val="F5EFE6"/>
+                <w:sz w:val="20"/>
+                <w:szCs w:val="20"/>
+              </w:rPr>
+              <w:t xml:space="preserve">Position</w:t>
+            </w:r>
+          </w:p>
+        </w:tc>
+        <w:tc>
+          <w:tcPr>
+            <w:tcW w:type="dxa" w:w="1200"/>
+            <w:tcBorders>
+              <w:top w:val="single" w:color="EAE3D4" w:sz="6"/>
+              <w:left w:val="single" w:color="EAE3D4" w:sz="6"/>
+              <w:bottom w:val="single" w:color="EAE3D4" w:sz="6"/>
+              <w:right w:val="single" w:color="EAE3D4" w:sz="6"/>
+            </w:tcBorders>
+            <w:shd w:fill="1A1612" w:val="clear"/>
+            <w:tcMar>
+              <w:top w:type="dxa" w:w="120"/>
+              <w:left w:type="dxa" w:w="160"/>
+              <w:bottom w:type="dxa" w:w="120"/>
+              <w:right w:type="dxa" w:w="160"/>
+            </w:tcMar>
+            <w:vAlign w:val="center"/>
+          </w:tcPr>
+          <w:p>
+            <w:pPr>
+              <w:jc w:val="right"/>
+            </w:pPr>
+            <w:r>
+              <w:rPr>
+                <w:rFonts w:ascii="Calibri" w:cs="Calibri" w:eastAsia="Calibri" w:hAnsi="Calibri"/>
+                <w:b/>
+                <w:bCs/>
+                <w:color w:val="F5EFE6"/>
+                <w:sz w:val="20"/>
+                <w:szCs w:val="20"/>
+              </w:rPr>
+              <w:t xml:space="preserve">Start</w:t>
+            </w:r>
+          </w:p>
+        </w:tc>
+        <w:tc>
+          <w:tcPr>
+            <w:tcW w:type="dxa" w:w="1200"/>
+            <w:tcBorders>
+              <w:top w:val="single" w:color="EAE3D4" w:sz="6"/>
+              <w:left w:val="single" w:color="EAE3D4" w:sz="6"/>
+              <w:bottom w:val="single" w:color="EAE3D4" w:sz="6"/>
+              <w:right w:val="single" w:color="EAE3D4" w:sz="6"/>
+            </w:tcBorders>
+            <w:shd w:fill="1A1612" w:val="clear"/>
+            <w:tcMar>
+              <w:top w:type="dxa" w:w="120"/>
+              <w:left w:type="dxa" w:w="160"/>
+              <w:bottom w:type="dxa" w:w="120"/>
+              <w:right w:type="dxa" w:w="160"/>
+            </w:tcMar>
+            <w:vAlign w:val="center"/>
+          </w:tcPr>
+          <w:p>
+            <w:pPr>
+              <w:jc w:val="right"/>
+            </w:pPr>
+            <w:r>
+              <w:rPr>
+                <w:rFonts w:ascii="Calibri" w:cs="Calibri" w:eastAsia="Calibri" w:hAnsi="Calibri"/>
+                <w:b/>
+                <w:bCs/>
+                <w:color w:val="F5EFE6"/>
+                <w:sz w:val="20"/>
+                <w:szCs w:val="20"/>
+              </w:rPr>
+              <w:t xml:space="preserve">Brutto/Jahr</w:t>
+            </w:r>
+          </w:p>
+        </w:tc>
+        <w:tc>
+          <w:tcPr>
+            <w:tcW w:type="dxa" w:w="1300"/>
+            <w:tcBorders>
+              <w:top w:val="single" w:color="EAE3D4" w:sz="6"/>
+              <w:left w:val="single" w:color="EAE3D4" w:sz="6"/>
+              <w:bottom w:val="single" w:color="EAE3D4" w:sz="6"/>
+              <w:right w:val="single" w:color="EAE3D4" w:sz="6"/>
+            </w:tcBorders>
+            <w:shd w:fill="1A1612" w:val="clear"/>
+            <w:tcMar>
+              <w:top w:type="dxa" w:w="120"/>
+              <w:left w:type="dxa" w:w="160"/>
+              <w:bottom w:type="dxa" w:w="120"/>
+              <w:right w:type="dxa" w:w="160"/>
+            </w:tcMar>
+            <w:vAlign w:val="center"/>
+          </w:tcPr>
+          <w:p>
+            <w:pPr>
+              <w:jc w:val="right"/>
+            </w:pPr>
+            <w:r>
+              <w:rPr>
+                <w:rFonts w:ascii="Calibri" w:cs="Calibri" w:eastAsia="Calibri" w:hAnsi="Calibri"/>
+                <w:b/>
+                <w:bCs/>
+                <w:color w:val="F5EFE6"/>
+                <w:sz w:val="20"/>
+                <w:szCs w:val="20"/>
+              </w:rPr>
+              <w:t xml:space="preserve">Laufzeit</w:t>
+            </w:r>
+          </w:p>
+        </w:tc>
+        <w:tc>
+          <w:tcPr>
+            <w:tcW w:type="dxa" w:w="1500"/>
+            <w:tcBorders>
+              <w:top w:val="single" w:color="EAE3D4" w:sz="6"/>
+              <w:left w:val="single" w:color="EAE3D4" w:sz="6"/>
+              <w:bottom w:val="single" w:color="EAE3D4" w:sz="6"/>
+              <w:right w:val="single" w:color="EAE3D4" w:sz="6"/>
+            </w:tcBorders>
+            <w:shd w:fill="1A1612" w:val="clear"/>
+            <w:tcMar>
+              <w:top w:type="dxa" w:w="120"/>
+              <w:left w:type="dxa" w:w="160"/>
+              <w:bottom w:type="dxa" w:w="120"/>
+              <w:right w:type="dxa" w:w="160"/>
+            </w:tcMar>
+            <w:vAlign w:val="center"/>
+          </w:tcPr>
+          <w:p>
+            <w:pPr>
+              <w:jc w:val="right"/>
+            </w:pPr>
+            <w:r>
+              <w:rPr>
+                <w:rFonts w:ascii="Calibri" w:cs="Calibri" w:eastAsia="Calibri" w:hAnsi="Calibri"/>
+                <w:b/>
+                <w:bCs/>
+                <w:color w:val="F5EFE6"/>
+                <w:sz w:val="20"/>
+                <w:szCs w:val="20"/>
+              </w:rPr>
+              <w:t xml:space="preserve">Kosten all-in</w:t>
+            </w:r>
+          </w:p>
+        </w:tc>
+      </w:tr>
+      <w:tr>
+        <w:tc>
+          <w:tcPr>
+            <w:tcW w:type="dxa" w:w="2800"/>
+            <w:tcBorders>
+              <w:top w:val="single" w:color="EAE3D4" w:sz="6"/>
+              <w:left w:val="single" w:color="EAE3D4" w:sz="6"/>
+              <w:bottom w:val="single" w:color="EAE3D4" w:sz="6"/>
+              <w:right w:val="single" w:color="EAE3D4" w:sz="6"/>
+            </w:tcBorders>
+            <w:tcMar>
+              <w:top w:type="dxa" w:w="120"/>
+              <w:left w:type="dxa" w:w="160"/>
+              <w:bottom w:type="dxa" w:w="120"/>
+              <w:right w:type="dxa" w:w="160"/>
+            </w:tcMar>
+            <w:vAlign w:val="center"/>
+          </w:tcPr>
+          <w:p>
+            <w:pPr>
+              <w:jc w:val="left"/>
+            </w:pPr>
+            <w:r>
+              <w:rPr>
+                <w:rFonts w:ascii="Calibri" w:cs="Calibri" w:eastAsia="Calibri" w:hAnsi="Calibri"/>
+                <w:b w:val="false"/>
+                <w:bCs w:val="false"/>
+                <w:color w:val="1A1612"/>
+                <w:sz w:val="20"/>
+                <w:szCs w:val="20"/>
+              </w:rPr>
+              <w:t xml:space="preserve">Head of Operations</w:t>
+            </w:r>
+          </w:p>
+        </w:tc>
+        <w:tc>
+          <w:tcPr>
+            <w:tcW w:type="dxa" w:w="1200"/>
+            <w:tcBorders>
+              <w:top w:val="single" w:color="EAE3D4" w:sz="6"/>
+              <w:left w:val="single" w:color="EAE3D4" w:sz="6"/>
+              <w:bottom w:val="single" w:color="EAE3D4" w:sz="6"/>
+              <w:right w:val="single" w:color="EAE3D4" w:sz="6"/>
+            </w:tcBorders>
+            <w:tcMar>
+              <w:top w:type="dxa" w:w="120"/>
+              <w:left w:type="dxa" w:w="160"/>
+              <w:bottom w:type="dxa" w:w="120"/>
+              <w:right w:type="dxa" w:w="160"/>
+            </w:tcMar>
+            <w:vAlign w:val="center"/>
+          </w:tcPr>
+          <w:p>
+            <w:pPr>
+              <w:jc w:val="right"/>
+            </w:pPr>
+            <w:r>
+              <w:rPr>
+                <w:rFonts w:ascii="Calibri" w:cs="Calibri" w:eastAsia="Calibri" w:hAnsi="Calibri"/>
+                <w:b w:val="false"/>
+                <w:bCs w:val="false"/>
+                <w:color w:val="1A1612"/>
+                <w:sz w:val="20"/>
+                <w:szCs w:val="20"/>
+              </w:rPr>
+              <w:t xml:space="preserve">Q3 2026</w:t>
+            </w:r>
+          </w:p>
+        </w:tc>
+        <w:tc>
+          <w:tcPr>
+            <w:tcW w:type="dxa" w:w="1200"/>
+            <w:tcBorders>
+              <w:top w:val="single" w:color="EAE3D4" w:sz="6"/>
+              <w:left w:val="single" w:color="EAE3D4" w:sz="6"/>
+              <w:bottom w:val="single" w:color="EAE3D4" w:sz="6"/>
+              <w:right w:val="single" w:color="EAE3D4" w:sz="6"/>
+            </w:tcBorders>
+            <w:tcMar>
+              <w:top w:type="dxa" w:w="120"/>
+              <w:left w:type="dxa" w:w="160"/>
+              <w:bottom w:type="dxa" w:w="120"/>
+              <w:right w:type="dxa" w:w="160"/>
+            </w:tcMar>
+            <w:vAlign w:val="center"/>
+          </w:tcPr>
+          <w:p>
+            <w:pPr>
+              <w:jc w:val="right"/>
+            </w:pPr>
+            <w:r>
+              <w:rPr>
+                <w:rFonts w:ascii="Calibri" w:cs="Calibri" w:eastAsia="Calibri" w:hAnsi="Calibri"/>
+                <w:b w:val="false"/>
+                <w:bCs w:val="false"/>
+                <w:color w:val="1A1612"/>
+                <w:sz w:val="20"/>
+                <w:szCs w:val="20"/>
+              </w:rPr>
+              <w:t xml:space="preserve">70 T€</w:t>
+            </w:r>
+          </w:p>
+        </w:tc>
+        <w:tc>
+          <w:tcPr>
+            <w:tcW w:type="dxa" w:w="1300"/>
+            <w:tcBorders>
+              <w:top w:val="single" w:color="EAE3D4" w:sz="6"/>
+              <w:left w:val="single" w:color="EAE3D4" w:sz="6"/>
+              <w:bottom w:val="single" w:color="EAE3D4" w:sz="6"/>
+              <w:right w:val="single" w:color="EAE3D4" w:sz="6"/>
+            </w:tcBorders>
+            <w:tcMar>
+              <w:top w:type="dxa" w:w="120"/>
+              <w:left w:type="dxa" w:w="160"/>
+              <w:bottom w:type="dxa" w:w="120"/>
+              <w:right w:type="dxa" w:w="160"/>
+            </w:tcMar>
+            <w:vAlign w:val="center"/>
+          </w:tcPr>
+          <w:p>
+            <w:pPr>
+              <w:jc w:val="right"/>
+            </w:pPr>
+            <w:r>
+              <w:rPr>
+                <w:rFonts w:ascii="Calibri" w:cs="Calibri" w:eastAsia="Calibri" w:hAnsi="Calibri"/>
+                <w:b w:val="false"/>
+                <w:bCs w:val="false"/>
+                <w:color w:val="1A1612"/>
+                <w:sz w:val="20"/>
+                <w:szCs w:val="20"/>
+              </w:rPr>
+              <w:t xml:space="preserve">15 Monate</w:t>
+            </w:r>
+          </w:p>
+        </w:tc>
+        <w:tc>
+          <w:tcPr>
+            <w:tcW w:type="dxa" w:w="1500"/>
+            <w:tcBorders>
+              <w:top w:val="single" w:color="EAE3D4" w:sz="6"/>
+              <w:left w:val="single" w:color="EAE3D4" w:sz="6"/>
+              <w:bottom w:val="single" w:color="EAE3D4" w:sz="6"/>
+              <w:right w:val="single" w:color="EAE3D4" w:sz="6"/>
+            </w:tcBorders>
+            <w:tcMar>
+              <w:top w:type="dxa" w:w="120"/>
+              <w:left w:type="dxa" w:w="160"/>
+              <w:bottom w:type="dxa" w:w="120"/>
+              <w:right w:type="dxa" w:w="160"/>
+            </w:tcMar>
+            <w:vAlign w:val="center"/>
+          </w:tcPr>
+          <w:p>
+            <w:pPr>
+              <w:jc w:val="right"/>
+            </w:pPr>
+            <w:r>
+              <w:rPr>
+                <w:rFonts w:ascii="Calibri" w:cs="Calibri" w:eastAsia="Calibri" w:hAnsi="Calibri"/>
+                <w:b w:val="false"/>
+                <w:bCs w:val="false"/>
+                <w:color w:val="1A1612"/>
+                <w:sz w:val="20"/>
+                <w:szCs w:val="20"/>
+              </w:rPr>
+              <w:t xml:space="preserve">107 T€</w:t>
+            </w:r>
+          </w:p>
+        </w:tc>
+      </w:tr>
+      <w:tr>
+        <w:tc>
+          <w:tcPr>
+            <w:tcW w:type="dxa" w:w="2800"/>
+            <w:tcBorders>
+              <w:top w:val="single" w:color="EAE3D4" w:sz="6"/>
+              <w:left w:val="single" w:color="EAE3D4" w:sz="6"/>
+              <w:bottom w:val="single" w:color="EAE3D4" w:sz="6"/>
+              <w:right w:val="single" w:color="EAE3D4" w:sz="6"/>
+            </w:tcBorders>
+            <w:shd w:fill="FAF7F1" w:val="clear"/>
+            <w:tcMar>
+              <w:top w:type="dxa" w:w="120"/>
+              <w:left w:type="dxa" w:w="160"/>
+              <w:bottom w:type="dxa" w:w="120"/>
+              <w:right w:type="dxa" w:w="160"/>
+            </w:tcMar>
+            <w:vAlign w:val="center"/>
+          </w:tcPr>
+          <w:p>
+            <w:pPr>
+              <w:jc w:val="left"/>
+            </w:pPr>
+            <w:r>
+              <w:rPr>
+                <w:rFonts w:ascii="Calibri" w:cs="Calibri" w:eastAsia="Calibri" w:hAnsi="Calibri"/>
+                <w:b w:val="false"/>
+                <w:bCs w:val="false"/>
+                <w:color w:val="1A1612"/>
+                <w:sz w:val="20"/>
+                <w:szCs w:val="20"/>
+              </w:rPr>
+              <w:t xml:space="preserve">Care-Manager 1 (Frankfurt)</w:t>
+            </w:r>
+          </w:p>
+        </w:tc>
+        <w:tc>
+          <w:tcPr>
+            <w:tcW w:type="dxa" w:w="1200"/>
+            <w:tcBorders>
+              <w:top w:val="single" w:color="EAE3D4" w:sz="6"/>
+              <w:left w:val="single" w:color="EAE3D4" w:sz="6"/>
+              <w:bottom w:val="single" w:color="EAE3D4" w:sz="6"/>
+              <w:right w:val="single" w:color="EAE3D4" w:sz="6"/>
+            </w:tcBorders>
+            <w:shd w:fill="FAF7F1" w:val="clear"/>
+            <w:tcMar>
+              <w:top w:type="dxa" w:w="120"/>
+              <w:left w:type="dxa" w:w="160"/>
+              <w:bottom w:type="dxa" w:w="120"/>
+              <w:right w:type="dxa" w:w="160"/>
+            </w:tcMar>
+            <w:vAlign w:val="center"/>
+          </w:tcPr>
+          <w:p>
+            <w:pPr>
+              <w:jc w:val="right"/>
+            </w:pPr>
+            <w:r>
+              <w:rPr>
+                <w:rFonts w:ascii="Calibri" w:cs="Calibri" w:eastAsia="Calibri" w:hAnsi="Calibri"/>
+                <w:b w:val="false"/>
+                <w:bCs w:val="false"/>
+                <w:color w:val="1A1612"/>
+                <w:sz w:val="20"/>
+                <w:szCs w:val="20"/>
+              </w:rPr>
+              <w:t xml:space="preserve">Q2 2026</w:t>
+            </w:r>
+          </w:p>
+        </w:tc>
+        <w:tc>
+          <w:tcPr>
+            <w:tcW w:type="dxa" w:w="1200"/>
+            <w:tcBorders>
+              <w:top w:val="single" w:color="EAE3D4" w:sz="6"/>
+              <w:left w:val="single" w:color="EAE3D4" w:sz="6"/>
+              <w:bottom w:val="single" w:color="EAE3D4" w:sz="6"/>
+              <w:right w:val="single" w:color="EAE3D4" w:sz="6"/>
+            </w:tcBorders>
+            <w:shd w:fill="FAF7F1" w:val="clear"/>
+            <w:tcMar>
+              <w:top w:type="dxa" w:w="120"/>
+              <w:left w:type="dxa" w:w="160"/>
+              <w:bottom w:type="dxa" w:w="120"/>
+              <w:right w:type="dxa" w:w="160"/>
+            </w:tcMar>
+            <w:vAlign w:val="center"/>
+          </w:tcPr>
+          <w:p>
+            <w:pPr>
+              <w:jc w:val="right"/>
+            </w:pPr>
+            <w:r>
+              <w:rPr>
+                <w:rFonts w:ascii="Calibri" w:cs="Calibri" w:eastAsia="Calibri" w:hAnsi="Calibri"/>
+                <w:b w:val="false"/>
+                <w:bCs w:val="false"/>
+                <w:color w:val="1A1612"/>
+                <w:sz w:val="20"/>
+                <w:szCs w:val="20"/>
+              </w:rPr>
+              <w:t xml:space="preserve">48 T€</w:t>
+            </w:r>
+          </w:p>
+        </w:tc>
+        <w:tc>
+          <w:tcPr>
+            <w:tcW w:type="dxa" w:w="1300"/>
+            <w:tcBorders>
+              <w:top w:val="single" w:color="EAE3D4" w:sz="6"/>
+              <w:left w:val="single" w:color="EAE3D4" w:sz="6"/>
+              <w:bottom w:val="single" w:color="EAE3D4" w:sz="6"/>
+              <w:right w:val="single" w:color="EAE3D4" w:sz="6"/>
+            </w:tcBorders>
+            <w:shd w:fill="FAF7F1" w:val="clear"/>
+            <w:tcMar>
+              <w:top w:type="dxa" w:w="120"/>
+              <w:left w:type="dxa" w:w="160"/>
+              <w:bottom w:type="dxa" w:w="120"/>
+              <w:right w:type="dxa" w:w="160"/>
+            </w:tcMar>
+            <w:vAlign w:val="center"/>
+          </w:tcPr>
+          <w:p>
+            <w:pPr>
+              <w:jc w:val="right"/>
+            </w:pPr>
+            <w:r>
+              <w:rPr>
+                <w:rFonts w:ascii="Calibri" w:cs="Calibri" w:eastAsia="Calibri" w:hAnsi="Calibri"/>
+                <w:b w:val="false"/>
+                <w:bCs w:val="false"/>
+                <w:color w:val="1A1612"/>
+                <w:sz w:val="20"/>
+                <w:szCs w:val="20"/>
+              </w:rPr>
+              <w:t xml:space="preserve">16 Monate</w:t>
+            </w:r>
+          </w:p>
+        </w:tc>
+        <w:tc>
+          <w:tcPr>
+            <w:tcW w:type="dxa" w:w="1500"/>
+            <w:tcBorders>
+              <w:top w:val="single" w:color="EAE3D4" w:sz="6"/>
+              <w:left w:val="single" w:color="EAE3D4" w:sz="6"/>
+              <w:bottom w:val="single" w:color="EAE3D4" w:sz="6"/>
+              <w:right w:val="single" w:color="EAE3D4" w:sz="6"/>
+            </w:tcBorders>
+            <w:shd w:fill="FAF7F1" w:val="clear"/>
+            <w:tcMar>
+              <w:top w:type="dxa" w:w="120"/>
+              <w:left w:type="dxa" w:w="160"/>
+              <w:bottom w:type="dxa" w:w="120"/>
+              <w:right w:type="dxa" w:w="160"/>
+            </w:tcMar>
+            <w:vAlign w:val="center"/>
+          </w:tcPr>
+          <w:p>
+            <w:pPr>
+              <w:jc w:val="right"/>
+            </w:pPr>
+            <w:r>
+              <w:rPr>
+                <w:rFonts w:ascii="Calibri" w:cs="Calibri" w:eastAsia="Calibri" w:hAnsi="Calibri"/>
+                <w:b w:val="false"/>
+                <w:bCs w:val="false"/>
+                <w:color w:val="1A1612"/>
+                <w:sz w:val="20"/>
+                <w:szCs w:val="20"/>
+              </w:rPr>
+              <w:t xml:space="preserve">78 T€</w:t>
+            </w:r>
+          </w:p>
+        </w:tc>
+      </w:tr>
+      <w:tr>
+        <w:tc>
+          <w:tcPr>
+            <w:tcW w:type="dxa" w:w="2800"/>
+            <w:tcBorders>
+              <w:top w:val="single" w:color="EAE3D4" w:sz="6"/>
+              <w:left w:val="single" w:color="EAE3D4" w:sz="6"/>
+              <w:bottom w:val="single" w:color="EAE3D4" w:sz="6"/>
+              <w:right w:val="single" w:color="EAE3D4" w:sz="6"/>
+            </w:tcBorders>
+            <w:tcMar>
+              <w:top w:type="dxa" w:w="120"/>
+              <w:left w:type="dxa" w:w="160"/>
+              <w:bottom w:type="dxa" w:w="120"/>
+              <w:right w:type="dxa" w:w="160"/>
+            </w:tcMar>
+            <w:vAlign w:val="center"/>
+          </w:tcPr>
+          <w:p>
+            <w:pPr>
+              <w:jc w:val="left"/>
+            </w:pPr>
+            <w:r>
+              <w:rPr>
+                <w:rFonts w:ascii="Calibri" w:cs="Calibri" w:eastAsia="Calibri" w:hAnsi="Calibri"/>
+                <w:b w:val="false"/>
+                <w:bCs w:val="false"/>
+                <w:color w:val="1A1612"/>
+                <w:sz w:val="20"/>
+                <w:szCs w:val="20"/>
+              </w:rPr>
+              <w:t xml:space="preserve">Growth Marketer</w:t>
+            </w:r>
+          </w:p>
+        </w:tc>
+        <w:tc>
+          <w:tcPr>
+            <w:tcW w:type="dxa" w:w="1200"/>
+            <w:tcBorders>
+              <w:top w:val="single" w:color="EAE3D4" w:sz="6"/>
+              <w:left w:val="single" w:color="EAE3D4" w:sz="6"/>
+              <w:bottom w:val="single" w:color="EAE3D4" w:sz="6"/>
+              <w:right w:val="single" w:color="EAE3D4" w:sz="6"/>
+            </w:tcBorders>
+            <w:tcMar>
+              <w:top w:type="dxa" w:w="120"/>
+              <w:left w:type="dxa" w:w="160"/>
+              <w:bottom w:type="dxa" w:w="120"/>
+              <w:right w:type="dxa" w:w="160"/>
+            </w:tcMar>
+            <w:vAlign w:val="center"/>
+          </w:tcPr>
+          <w:p>
+            <w:pPr>
+              <w:jc w:val="right"/>
+            </w:pPr>
+            <w:r>
+              <w:rPr>
+                <w:rFonts w:ascii="Calibri" w:cs="Calibri" w:eastAsia="Calibri" w:hAnsi="Calibri"/>
+                <w:b w:val="false"/>
+                <w:bCs w:val="false"/>
+                <w:color w:val="1A1612"/>
+                <w:sz w:val="20"/>
+                <w:szCs w:val="20"/>
+              </w:rPr>
+              <w:t xml:space="preserve">Q3 2026</w:t>
+            </w:r>
+          </w:p>
+        </w:tc>
+        <w:tc>
+          <w:tcPr>
+            <w:tcW w:type="dxa" w:w="1200"/>
+            <w:tcBorders>
+              <w:top w:val="single" w:color="EAE3D4" w:sz="6"/>
+              <w:left w:val="single" w:color="EAE3D4" w:sz="6"/>
+              <w:bottom w:val="single" w:color="EAE3D4" w:sz="6"/>
+              <w:right w:val="single" w:color="EAE3D4" w:sz="6"/>
+            </w:tcBorders>
+            <w:tcMar>
+              <w:top w:type="dxa" w:w="120"/>
+              <w:left w:type="dxa" w:w="160"/>
+              <w:bottom w:type="dxa" w:w="120"/>
+              <w:right w:type="dxa" w:w="160"/>
+            </w:tcMar>
+            <w:vAlign w:val="center"/>
+          </w:tcPr>
+          <w:p>
+            <w:pPr>
+              <w:jc w:val="right"/>
+            </w:pPr>
+            <w:r>
+              <w:rPr>
+                <w:rFonts w:ascii="Calibri" w:cs="Calibri" w:eastAsia="Calibri" w:hAnsi="Calibri"/>
+                <w:b w:val="false"/>
+                <w:bCs w:val="false"/>
+                <w:color w:val="1A1612"/>
+                <w:sz w:val="20"/>
+                <w:szCs w:val="20"/>
+              </w:rPr>
+              <w:t xml:space="preserve">58 T€</w:t>
+            </w:r>
+          </w:p>
+        </w:tc>
+        <w:tc>
+          <w:tcPr>
+            <w:tcW w:type="dxa" w:w="1300"/>
+            <w:tcBorders>
+              <w:top w:val="single" w:color="EAE3D4" w:sz="6"/>
+              <w:left w:val="single" w:color="EAE3D4" w:sz="6"/>
+              <w:bottom w:val="single" w:color="EAE3D4" w:sz="6"/>
+              <w:right w:val="single" w:color="EAE3D4" w:sz="6"/>
+            </w:tcBorders>
+            <w:tcMar>
+              <w:top w:type="dxa" w:w="120"/>
+              <w:left w:type="dxa" w:w="160"/>
+              <w:bottom w:type="dxa" w:w="120"/>
+              <w:right w:type="dxa" w:w="160"/>
+            </w:tcMar>
+            <w:vAlign w:val="center"/>
+          </w:tcPr>
+          <w:p>
+            <w:pPr>
+              <w:jc w:val="right"/>
+            </w:pPr>
+            <w:r>
+              <w:rPr>
+                <w:rFonts w:ascii="Calibri" w:cs="Calibri" w:eastAsia="Calibri" w:hAnsi="Calibri"/>
+                <w:b w:val="false"/>
+                <w:bCs w:val="false"/>
+                <w:color w:val="1A1612"/>
+                <w:sz w:val="20"/>
+                <w:szCs w:val="20"/>
+              </w:rPr>
+              <w:t xml:space="preserve">15 Monate</w:t>
+            </w:r>
+          </w:p>
+        </w:tc>
+        <w:tc>
+          <w:tcPr>
+            <w:tcW w:type="dxa" w:w="1500"/>
+            <w:tcBorders>
+              <w:top w:val="single" w:color="EAE3D4" w:sz="6"/>
+              <w:left w:val="single" w:color="EAE3D4" w:sz="6"/>
+              <w:bottom w:val="single" w:color="EAE3D4" w:sz="6"/>
+              <w:right w:val="single" w:color="EAE3D4" w:sz="6"/>
+            </w:tcBorders>
+            <w:tcMar>
+              <w:top w:type="dxa" w:w="120"/>
+              <w:left w:type="dxa" w:w="160"/>
+              <w:bottom w:type="dxa" w:w="120"/>
+              <w:right w:type="dxa" w:w="160"/>
+            </w:tcMar>
+            <w:vAlign w:val="center"/>
+          </w:tcPr>
+          <w:p>
+            <w:pPr>
+              <w:jc w:val="right"/>
+            </w:pPr>
+            <w:r>
+              <w:rPr>
+                <w:rFonts w:ascii="Calibri" w:cs="Calibri" w:eastAsia="Calibri" w:hAnsi="Calibri"/>
+                <w:b w:val="false"/>
+                <w:bCs w:val="false"/>
+                <w:color w:val="1A1612"/>
+                <w:sz w:val="20"/>
+                <w:szCs w:val="20"/>
+              </w:rPr>
+              <w:t xml:space="preserve">88 T€</w:t>
+            </w:r>
+          </w:p>
+        </w:tc>
+      </w:tr>
+      <w:tr>
+        <w:tc>
+          <w:tcPr>
+            <w:tcW w:type="dxa" w:w="2800"/>
+            <w:tcBorders>
+              <w:top w:val="single" w:color="EAE3D4" w:sz="6"/>
+              <w:left w:val="single" w:color="EAE3D4" w:sz="6"/>
+              <w:bottom w:val="single" w:color="EAE3D4" w:sz="6"/>
+              <w:right w:val="single" w:color="EAE3D4" w:sz="6"/>
+            </w:tcBorders>
+            <w:shd w:fill="FAF7F1" w:val="clear"/>
+            <w:tcMar>
+              <w:top w:type="dxa" w:w="120"/>
+              <w:left w:type="dxa" w:w="160"/>
+              <w:bottom w:type="dxa" w:w="120"/>
+              <w:right w:type="dxa" w:w="160"/>
+            </w:tcMar>
+            <w:vAlign w:val="center"/>
+          </w:tcPr>
+          <w:p>
+            <w:pPr>
+              <w:jc w:val="left"/>
+            </w:pPr>
+            <w:r>
+              <w:rPr>
+                <w:rFonts w:ascii="Calibri" w:cs="Calibri" w:eastAsia="Calibri" w:hAnsi="Calibri"/>
+                <w:b w:val="false"/>
+                <w:bCs w:val="false"/>
+                <w:color w:val="1A1612"/>
+                <w:sz w:val="20"/>
+                <w:szCs w:val="20"/>
+              </w:rPr>
+              <w:t xml:space="preserve">Care-Manager 2 (Köln)</w:t>
+            </w:r>
+          </w:p>
+        </w:tc>
+        <w:tc>
+          <w:tcPr>
+            <w:tcW w:type="dxa" w:w="1200"/>
+            <w:tcBorders>
+              <w:top w:val="single" w:color="EAE3D4" w:sz="6"/>
+              <w:left w:val="single" w:color="EAE3D4" w:sz="6"/>
+              <w:bottom w:val="single" w:color="EAE3D4" w:sz="6"/>
+              <w:right w:val="single" w:color="EAE3D4" w:sz="6"/>
+            </w:tcBorders>
+            <w:shd w:fill="FAF7F1" w:val="clear"/>
+            <w:tcMar>
+              <w:top w:type="dxa" w:w="120"/>
+              <w:left w:type="dxa" w:w="160"/>
+              <w:bottom w:type="dxa" w:w="120"/>
+              <w:right w:type="dxa" w:w="160"/>
+            </w:tcMar>
+            <w:vAlign w:val="center"/>
+          </w:tcPr>
+          <w:p>
+            <w:pPr>
+              <w:jc w:val="right"/>
+            </w:pPr>
+            <w:r>
+              <w:rPr>
+                <w:rFonts w:ascii="Calibri" w:cs="Calibri" w:eastAsia="Calibri" w:hAnsi="Calibri"/>
+                <w:b w:val="false"/>
+                <w:bCs w:val="false"/>
+                <w:color w:val="1A1612"/>
+                <w:sz w:val="20"/>
+                <w:szCs w:val="20"/>
+              </w:rPr>
+              <w:t xml:space="preserve">Q1 2027</w:t>
+            </w:r>
+          </w:p>
+        </w:tc>
+        <w:tc>
+          <w:tcPr>
+            <w:tcW w:type="dxa" w:w="1200"/>
+            <w:tcBorders>
+              <w:top w:val="single" w:color="EAE3D4" w:sz="6"/>
+              <w:left w:val="single" w:color="EAE3D4" w:sz="6"/>
+              <w:bottom w:val="single" w:color="EAE3D4" w:sz="6"/>
+              <w:right w:val="single" w:color="EAE3D4" w:sz="6"/>
+            </w:tcBorders>
+            <w:shd w:fill="FAF7F1" w:val="clear"/>
+            <w:tcMar>
+              <w:top w:type="dxa" w:w="120"/>
+              <w:left w:type="dxa" w:w="160"/>
+              <w:bottom w:type="dxa" w:w="120"/>
+              <w:right w:type="dxa" w:w="160"/>
+            </w:tcMar>
+            <w:vAlign w:val="center"/>
+          </w:tcPr>
+          <w:p>
+            <w:pPr>
+              <w:jc w:val="right"/>
+            </w:pPr>
+            <w:r>
+              <w:rPr>
+                <w:rFonts w:ascii="Calibri" w:cs="Calibri" w:eastAsia="Calibri" w:hAnsi="Calibri"/>
+                <w:b w:val="false"/>
+                <w:bCs w:val="false"/>
+                <w:color w:val="1A1612"/>
+                <w:sz w:val="20"/>
+                <w:szCs w:val="20"/>
+              </w:rPr>
+              <w:t xml:space="preserve">48 T€</w:t>
+            </w:r>
+          </w:p>
+        </w:tc>
+        <w:tc>
+          <w:tcPr>
+            <w:tcW w:type="dxa" w:w="1300"/>
+            <w:tcBorders>
+              <w:top w:val="single" w:color="EAE3D4" w:sz="6"/>
+              <w:left w:val="single" w:color="EAE3D4" w:sz="6"/>
+              <w:bottom w:val="single" w:color="EAE3D4" w:sz="6"/>
+              <w:right w:val="single" w:color="EAE3D4" w:sz="6"/>
+            </w:tcBorders>
+            <w:shd w:fill="FAF7F1" w:val="clear"/>
+            <w:tcMar>
+              <w:top w:type="dxa" w:w="120"/>
+              <w:left w:type="dxa" w:w="160"/>
+              <w:bottom w:type="dxa" w:w="120"/>
+              <w:right w:type="dxa" w:w="160"/>
+            </w:tcMar>
+            <w:vAlign w:val="center"/>
+          </w:tcPr>
+          <w:p>
+            <w:pPr>
+              <w:jc w:val="right"/>
+            </w:pPr>
+            <w:r>
+              <w:rPr>
+                <w:rFonts w:ascii="Calibri" w:cs="Calibri" w:eastAsia="Calibri" w:hAnsi="Calibri"/>
+                <w:b w:val="false"/>
+                <w:bCs w:val="false"/>
+                <w:color w:val="1A1612"/>
+                <w:sz w:val="20"/>
+                <w:szCs w:val="20"/>
+              </w:rPr>
+              <w:t xml:space="preserve">9 Monate</w:t>
+            </w:r>
+          </w:p>
+        </w:tc>
+        <w:tc>
+          <w:tcPr>
+            <w:tcW w:type="dxa" w:w="1500"/>
+            <w:tcBorders>
+              <w:top w:val="single" w:color="EAE3D4" w:sz="6"/>
+              <w:left w:val="single" w:color="EAE3D4" w:sz="6"/>
+              <w:bottom w:val="single" w:color="EAE3D4" w:sz="6"/>
+              <w:right w:val="single" w:color="EAE3D4" w:sz="6"/>
+            </w:tcBorders>
+            <w:shd w:fill="FAF7F1" w:val="clear"/>
+            <w:tcMar>
+              <w:top w:type="dxa" w:w="120"/>
+              <w:left w:type="dxa" w:w="160"/>
+              <w:bottom w:type="dxa" w:w="120"/>
+              <w:right w:type="dxa" w:w="160"/>
+            </w:tcMar>
+            <w:vAlign w:val="center"/>
+          </w:tcPr>
+          <w:p>
+            <w:pPr>
+              <w:jc w:val="right"/>
+            </w:pPr>
+            <w:r>
+              <w:rPr>
+                <w:rFonts w:ascii="Calibri" w:cs="Calibri" w:eastAsia="Calibri" w:hAnsi="Calibri"/>
+                <w:b w:val="false"/>
+                <w:bCs w:val="false"/>
+                <w:color w:val="1A1612"/>
+                <w:sz w:val="20"/>
+                <w:szCs w:val="20"/>
+              </w:rPr>
+              <w:t xml:space="preserve">44 T€</w:t>
+            </w:r>
+          </w:p>
+        </w:tc>
+      </w:tr>
+      <w:tr>
+        <w:tc>
+          <w:tcPr>
+            <w:tcW w:type="dxa" w:w="2800"/>
+            <w:tcBorders>
+              <w:top w:val="single" w:color="EAE3D4" w:sz="6"/>
+              <w:left w:val="single" w:color="EAE3D4" w:sz="6"/>
+              <w:bottom w:val="single" w:color="EAE3D4" w:sz="6"/>
+              <w:right w:val="single" w:color="EAE3D4" w:sz="6"/>
+            </w:tcBorders>
+            <w:tcMar>
+              <w:top w:type="dxa" w:w="120"/>
+              <w:left w:type="dxa" w:w="160"/>
+              <w:bottom w:type="dxa" w:w="120"/>
+              <w:right w:type="dxa" w:w="160"/>
+            </w:tcMar>
+            <w:vAlign w:val="center"/>
+          </w:tcPr>
+          <w:p>
+            <w:pPr>
+              <w:jc w:val="left"/>
+            </w:pPr>
+            <w:r>
+              <w:rPr>
+                <w:rFonts w:ascii="Calibri" w:cs="Calibri" w:eastAsia="Calibri" w:hAnsi="Calibri"/>
+                <w:b w:val="false"/>
+                <w:bCs w:val="false"/>
+                <w:color w:val="1A1612"/>
+                <w:sz w:val="20"/>
+                <w:szCs w:val="20"/>
+              </w:rPr>
+              <w:t xml:space="preserve">Partner-Manager (Kassen, B2B)</w:t>
+            </w:r>
+          </w:p>
+        </w:tc>
+        <w:tc>
+          <w:tcPr>
+            <w:tcW w:type="dxa" w:w="1200"/>
+            <w:tcBorders>
+              <w:top w:val="single" w:color="EAE3D4" w:sz="6"/>
+              <w:left w:val="single" w:color="EAE3D4" w:sz="6"/>
+              <w:bottom w:val="single" w:color="EAE3D4" w:sz="6"/>
+              <w:right w:val="single" w:color="EAE3D4" w:sz="6"/>
+            </w:tcBorders>
+            <w:tcMar>
+              <w:top w:type="dxa" w:w="120"/>
+              <w:left w:type="dxa" w:w="160"/>
+              <w:bottom w:type="dxa" w:w="120"/>
+              <w:right w:type="dxa" w:w="160"/>
+            </w:tcMar>
+            <w:vAlign w:val="center"/>
+          </w:tcPr>
+          <w:p>
+            <w:pPr>
+              <w:jc w:val="right"/>
+            </w:pPr>
+            <w:r>
+              <w:rPr>
+                <w:rFonts w:ascii="Calibri" w:cs="Calibri" w:eastAsia="Calibri" w:hAnsi="Calibri"/>
+                <w:b w:val="false"/>
+                <w:bCs w:val="false"/>
+                <w:color w:val="1A1612"/>
+                <w:sz w:val="20"/>
+                <w:szCs w:val="20"/>
+              </w:rPr>
+              <w:t xml:space="preserve">Q3 2027</w:t>
+            </w:r>
+          </w:p>
+        </w:tc>
+        <w:tc>
+          <w:tcPr>
+            <w:tcW w:type="dxa" w:w="1200"/>
+            <w:tcBorders>
+              <w:top w:val="single" w:color="EAE3D4" w:sz="6"/>
+              <w:left w:val="single" w:color="EAE3D4" w:sz="6"/>
+              <w:bottom w:val="single" w:color="EAE3D4" w:sz="6"/>
+              <w:right w:val="single" w:color="EAE3D4" w:sz="6"/>
+            </w:tcBorders>
+            <w:tcMar>
+              <w:top w:type="dxa" w:w="120"/>
+              <w:left w:type="dxa" w:w="160"/>
+              <w:bottom w:type="dxa" w:w="120"/>
+              <w:right w:type="dxa" w:w="160"/>
+            </w:tcMar>
+            <w:vAlign w:val="center"/>
+          </w:tcPr>
+          <w:p>
+            <w:pPr>
+              <w:jc w:val="right"/>
+            </w:pPr>
+            <w:r>
+              <w:rPr>
+                <w:rFonts w:ascii="Calibri" w:cs="Calibri" w:eastAsia="Calibri" w:hAnsi="Calibri"/>
+                <w:b w:val="false"/>
+                <w:bCs w:val="false"/>
+                <w:color w:val="1A1612"/>
+                <w:sz w:val="20"/>
+                <w:szCs w:val="20"/>
+              </w:rPr>
+              <w:t xml:space="preserve">60 T€</w:t>
+            </w:r>
+          </w:p>
+        </w:tc>
+        <w:tc>
+          <w:tcPr>
+            <w:tcW w:type="dxa" w:w="1300"/>
+            <w:tcBorders>
+              <w:top w:val="single" w:color="EAE3D4" w:sz="6"/>
+              <w:left w:val="single" w:color="EAE3D4" w:sz="6"/>
+              <w:bottom w:val="single" w:color="EAE3D4" w:sz="6"/>
+              <w:right w:val="single" w:color="EAE3D4" w:sz="6"/>
+            </w:tcBorders>
+            <w:tcMar>
+              <w:top w:type="dxa" w:w="120"/>
+              <w:left w:type="dxa" w:w="160"/>
+              <w:bottom w:type="dxa" w:w="120"/>
+              <w:right w:type="dxa" w:w="160"/>
+            </w:tcMar>
+            <w:vAlign w:val="center"/>
+          </w:tcPr>
+          <w:p>
+            <w:pPr>
+              <w:jc w:val="right"/>
+            </w:pPr>
+            <w:r>
+              <w:rPr>
+                <w:rFonts w:ascii="Calibri" w:cs="Calibri" w:eastAsia="Calibri" w:hAnsi="Calibri"/>
+                <w:b w:val="false"/>
+                <w:bCs w:val="false"/>
+                <w:color w:val="1A1612"/>
+                <w:sz w:val="20"/>
+                <w:szCs w:val="20"/>
+              </w:rPr>
+              <w:t xml:space="preserve">6 Monate</w:t>
+            </w:r>
+          </w:p>
+        </w:tc>
+        <w:tc>
+          <w:tcPr>
+            <w:tcW w:type="dxa" w:w="1500"/>
+            <w:tcBorders>
+              <w:top w:val="single" w:color="EAE3D4" w:sz="6"/>
+              <w:left w:val="single" w:color="EAE3D4" w:sz="6"/>
+              <w:bottom w:val="single" w:color="EAE3D4" w:sz="6"/>
+              <w:right w:val="single" w:color="EAE3D4" w:sz="6"/>
+            </w:tcBorders>
+            <w:tcMar>
+              <w:top w:type="dxa" w:w="120"/>
+              <w:left w:type="dxa" w:w="160"/>
+              <w:bottom w:type="dxa" w:w="120"/>
+              <w:right w:type="dxa" w:w="160"/>
+            </w:tcMar>
+            <w:vAlign w:val="center"/>
+          </w:tcPr>
+          <w:p>
+            <w:pPr>
+              <w:jc w:val="right"/>
+            </w:pPr>
+            <w:r>
+              <w:rPr>
+                <w:rFonts w:ascii="Calibri" w:cs="Calibri" w:eastAsia="Calibri" w:hAnsi="Calibri"/>
+                <w:b w:val="false"/>
+                <w:bCs w:val="false"/>
+                <w:color w:val="1A1612"/>
+                <w:sz w:val="20"/>
+                <w:szCs w:val="20"/>
+              </w:rPr>
+              <w:t xml:space="preserve">37 T€</w:t>
+            </w:r>
+          </w:p>
+        </w:tc>
+      </w:tr>
+      <w:tr>
+        <w:tc>
+          <w:tcPr>
+            <w:tcW w:type="dxa" w:w="2800"/>
+            <w:tcBorders>
+              <w:top w:val="single" w:color="EAE3D4" w:sz="6"/>
+              <w:left w:val="single" w:color="EAE3D4" w:sz="6"/>
+              <w:bottom w:val="single" w:color="EAE3D4" w:sz="6"/>
+              <w:right w:val="single" w:color="EAE3D4" w:sz="6"/>
+            </w:tcBorders>
+            <w:shd w:fill="FAF7F1" w:val="clear"/>
+            <w:tcMar>
+              <w:top w:type="dxa" w:w="120"/>
+              <w:left w:type="dxa" w:w="160"/>
+              <w:bottom w:type="dxa" w:w="120"/>
+              <w:right w:type="dxa" w:w="160"/>
+            </w:tcMar>
+            <w:vAlign w:val="center"/>
+          </w:tcPr>
+          <w:p>
+            <w:pPr>
+              <w:jc w:val="left"/>
+            </w:pPr>
+            <w:r>
+              <w:rPr>
+                <w:rFonts w:ascii="Calibri" w:cs="Calibri" w:eastAsia="Calibri" w:hAnsi="Calibri"/>
+                <w:b w:val="false"/>
+                <w:bCs w:val="false"/>
+                <w:color w:val="1A1612"/>
+                <w:sz w:val="20"/>
+                <w:szCs w:val="20"/>
+              </w:rPr>
+              <w:t xml:space="preserve">Freelancer-Puffer (Recht, Design, DevOps)</w:t>
+            </w:r>
+          </w:p>
+        </w:tc>
+        <w:tc>
+          <w:tcPr>
+            <w:tcW w:type="dxa" w:w="1200"/>
+            <w:tcBorders>
+              <w:top w:val="single" w:color="EAE3D4" w:sz="6"/>
+              <w:left w:val="single" w:color="EAE3D4" w:sz="6"/>
+              <w:bottom w:val="single" w:color="EAE3D4" w:sz="6"/>
+              <w:right w:val="single" w:color="EAE3D4" w:sz="6"/>
+            </w:tcBorders>
+            <w:shd w:fill="FAF7F1" w:val="clear"/>
+            <w:tcMar>
+              <w:top w:type="dxa" w:w="120"/>
+              <w:left w:type="dxa" w:w="160"/>
+              <w:bottom w:type="dxa" w:w="120"/>
+              <w:right w:type="dxa" w:w="160"/>
+            </w:tcMar>
+            <w:vAlign w:val="center"/>
+          </w:tcPr>
+          <w:p>
+            <w:pPr>
+              <w:jc w:val="right"/>
+            </w:pPr>
+            <w:r>
+              <w:rPr>
+                <w:rFonts w:ascii="Calibri" w:cs="Calibri" w:eastAsia="Calibri" w:hAnsi="Calibri"/>
+                <w:b w:val="false"/>
+                <w:bCs w:val="false"/>
+                <w:color w:val="1A1612"/>
+                <w:sz w:val="20"/>
+                <w:szCs w:val="20"/>
+              </w:rPr>
+              <w:t xml:space="preserve">laufend</w:t>
+            </w:r>
+          </w:p>
+        </w:tc>
+        <w:tc>
+          <w:tcPr>
+            <w:tcW w:type="dxa" w:w="1200"/>
+            <w:tcBorders>
+              <w:top w:val="single" w:color="EAE3D4" w:sz="6"/>
+              <w:left w:val="single" w:color="EAE3D4" w:sz="6"/>
+              <w:bottom w:val="single" w:color="EAE3D4" w:sz="6"/>
+              <w:right w:val="single" w:color="EAE3D4" w:sz="6"/>
+            </w:tcBorders>
+            <w:shd w:fill="FAF7F1" w:val="clear"/>
+            <w:tcMar>
+              <w:top w:type="dxa" w:w="120"/>
+              <w:left w:type="dxa" w:w="160"/>
+              <w:bottom w:type="dxa" w:w="120"/>
+              <w:right w:type="dxa" w:w="160"/>
+            </w:tcMar>
+            <w:vAlign w:val="center"/>
+          </w:tcPr>
+          <w:p>
+            <w:pPr>
+              <w:jc w:val="right"/>
+            </w:pPr>
+            <w:r>
+              <w:rPr>
+                <w:rFonts w:ascii="Calibri" w:cs="Calibri" w:eastAsia="Calibri" w:hAnsi="Calibri"/>
+                <w:b w:val="false"/>
+                <w:bCs w:val="false"/>
+                <w:color w:val="1A1612"/>
+                <w:sz w:val="20"/>
+                <w:szCs w:val="20"/>
+              </w:rPr>
+              <w:t xml:space="preserve">—</w:t>
+            </w:r>
+          </w:p>
+        </w:tc>
+        <w:tc>
+          <w:tcPr>
+            <w:tcW w:type="dxa" w:w="1300"/>
+            <w:tcBorders>
+              <w:top w:val="single" w:color="EAE3D4" w:sz="6"/>
+              <w:left w:val="single" w:color="EAE3D4" w:sz="6"/>
+              <w:bottom w:val="single" w:color="EAE3D4" w:sz="6"/>
+              <w:right w:val="single" w:color="EAE3D4" w:sz="6"/>
+            </w:tcBorders>
+            <w:shd w:fill="FAF7F1" w:val="clear"/>
+            <w:tcMar>
+              <w:top w:type="dxa" w:w="120"/>
+              <w:left w:type="dxa" w:w="160"/>
+              <w:bottom w:type="dxa" w:w="120"/>
+              <w:right w:type="dxa" w:w="160"/>
+            </w:tcMar>
+            <w:vAlign w:val="center"/>
+          </w:tcPr>
+          <w:p>
+            <w:pPr>
+              <w:jc w:val="right"/>
+            </w:pPr>
+            <w:r>
+              <w:rPr>
+                <w:rFonts w:ascii="Calibri" w:cs="Calibri" w:eastAsia="Calibri" w:hAnsi="Calibri"/>
+                <w:b w:val="false"/>
+                <w:bCs w:val="false"/>
+                <w:color w:val="1A1612"/>
+                <w:sz w:val="20"/>
+                <w:szCs w:val="20"/>
+              </w:rPr>
+              <w:t xml:space="preserve">18 Monate</w:t>
+            </w:r>
+          </w:p>
+        </w:tc>
+        <w:tc>
+          <w:tcPr>
+            <w:tcW w:type="dxa" w:w="1500"/>
+            <w:tcBorders>
+              <w:top w:val="single" w:color="EAE3D4" w:sz="6"/>
+              <w:left w:val="single" w:color="EAE3D4" w:sz="6"/>
+              <w:bottom w:val="single" w:color="EAE3D4" w:sz="6"/>
+              <w:right w:val="single" w:color="EAE3D4" w:sz="6"/>
+            </w:tcBorders>
+            <w:shd w:fill="FAF7F1" w:val="clear"/>
+            <w:tcMar>
+              <w:top w:type="dxa" w:w="120"/>
+              <w:left w:type="dxa" w:w="160"/>
+              <w:bottom w:type="dxa" w:w="120"/>
+              <w:right w:type="dxa" w:w="160"/>
+            </w:tcMar>
+            <w:vAlign w:val="center"/>
+          </w:tcPr>
+          <w:p>
+            <w:pPr>
+              <w:jc w:val="right"/>
+            </w:pPr>
+            <w:r>
+              <w:rPr>
+                <w:rFonts w:ascii="Calibri" w:cs="Calibri" w:eastAsia="Calibri" w:hAnsi="Calibri"/>
+                <w:b w:val="false"/>
+                <w:bCs w:val="false"/>
+                <w:color w:val="1A1612"/>
+                <w:sz w:val="20"/>
+                <w:szCs w:val="20"/>
+              </w:rPr>
+              <w:t xml:space="preserve">26 T€</w:t>
+            </w:r>
+          </w:p>
+        </w:tc>
+      </w:tr>
+      <w:tr>
+        <w:tc>
+          <w:tcPr>
+            <w:tcW w:type="dxa" w:w="2800"/>
+            <w:tcBorders>
+              <w:top w:val="single" w:color="EAE3D4" w:sz="6"/>
+              <w:left w:val="single" w:color="EAE3D4" w:sz="6"/>
+              <w:bottom w:val="single" w:color="EAE3D4" w:sz="6"/>
+              <w:right w:val="single" w:color="EAE3D4" w:sz="6"/>
+            </w:tcBorders>
+            <w:tcMar>
+              <w:top w:type="dxa" w:w="120"/>
+              <w:left w:type="dxa" w:w="160"/>
+              <w:bottom w:type="dxa" w:w="120"/>
+              <w:right w:type="dxa" w:w="160"/>
+            </w:tcMar>
+            <w:vAlign w:val="center"/>
+          </w:tcPr>
+          <w:p>
+            <w:pPr>
+              <w:jc w:val="left"/>
+            </w:pPr>
+            <w:r>
+              <w:rPr>
+                <w:rFonts w:ascii="Calibri" w:cs="Calibri" w:eastAsia="Calibri" w:hAnsi="Calibri"/>
+                <w:b w:val="false"/>
+                <w:bCs w:val="false"/>
+                <w:color w:val="1A1612"/>
+                <w:sz w:val="20"/>
+                <w:szCs w:val="20"/>
+              </w:rPr>
+              <w:t xml:space="preserve">Team-Summe (ohne Gründer)</w:t>
+            </w:r>
+          </w:p>
+        </w:tc>
+        <w:tc>
+          <w:tcPr>
+            <w:tcW w:type="dxa" w:w="1200"/>
+            <w:tcBorders>
+              <w:top w:val="single" w:color="EAE3D4" w:sz="6"/>
+              <w:left w:val="single" w:color="EAE3D4" w:sz="6"/>
+              <w:bottom w:val="single" w:color="EAE3D4" w:sz="6"/>
+              <w:right w:val="single" w:color="EAE3D4" w:sz="6"/>
+            </w:tcBorders>
+            <w:tcMar>
+              <w:top w:type="dxa" w:w="120"/>
+              <w:left w:type="dxa" w:w="160"/>
+              <w:bottom w:type="dxa" w:w="120"/>
+              <w:right w:type="dxa" w:w="160"/>
+            </w:tcMar>
+            <w:vAlign w:val="center"/>
+          </w:tcPr>
+          <w:p>
+            <w:pPr>
+              <w:jc w:val="right"/>
+            </w:pPr>
+            <w:r>
+              <w:rPr>
+                <w:rFonts w:ascii="Calibri" w:cs="Calibri" w:eastAsia="Calibri" w:hAnsi="Calibri"/>
+                <w:b w:val="false"/>
+                <w:bCs w:val="false"/>
+                <w:color w:val="1A1612"/>
+                <w:sz w:val="20"/>
+                <w:szCs w:val="20"/>
+              </w:rPr>
+              <w:t xml:space="preserve"/>
+            </w:r>
+          </w:p>
+        </w:tc>
+        <w:tc>
+          <w:tcPr>
+            <w:tcW w:type="dxa" w:w="1200"/>
+            <w:tcBorders>
+              <w:top w:val="single" w:color="EAE3D4" w:sz="6"/>
+              <w:left w:val="single" w:color="EAE3D4" w:sz="6"/>
+              <w:bottom w:val="single" w:color="EAE3D4" w:sz="6"/>
+              <w:right w:val="single" w:color="EAE3D4" w:sz="6"/>
+            </w:tcBorders>
+            <w:tcMar>
+              <w:top w:type="dxa" w:w="120"/>
+              <w:left w:type="dxa" w:w="160"/>
+              <w:bottom w:type="dxa" w:w="120"/>
+              <w:right w:type="dxa" w:w="160"/>
+            </w:tcMar>
+            <w:vAlign w:val="center"/>
+          </w:tcPr>
+          <w:p>
+            <w:pPr>
+              <w:jc w:val="right"/>
+            </w:pPr>
+            <w:r>
+              <w:rPr>
+                <w:rFonts w:ascii="Calibri" w:cs="Calibri" w:eastAsia="Calibri" w:hAnsi="Calibri"/>
+                <w:b w:val="false"/>
+                <w:bCs w:val="false"/>
+                <w:color w:val="1A1612"/>
+                <w:sz w:val="20"/>
+                <w:szCs w:val="20"/>
+              </w:rPr>
+              <w:t xml:space="preserve"/>
+            </w:r>
+          </w:p>
+        </w:tc>
+        <w:tc>
+          <w:tcPr>
+            <w:tcW w:type="dxa" w:w="1300"/>
+            <w:tcBorders>
+              <w:top w:val="single" w:color="EAE3D4" w:sz="6"/>
+              <w:left w:val="single" w:color="EAE3D4" w:sz="6"/>
+              <w:bottom w:val="single" w:color="EAE3D4" w:sz="6"/>
+              <w:right w:val="single" w:color="EAE3D4" w:sz="6"/>
+            </w:tcBorders>
+            <w:tcMar>
+              <w:top w:type="dxa" w:w="120"/>
+              <w:left w:type="dxa" w:w="160"/>
+              <w:bottom w:type="dxa" w:w="120"/>
+              <w:right w:type="dxa" w:w="160"/>
+            </w:tcMar>
+            <w:vAlign w:val="center"/>
+          </w:tcPr>
+          <w:p>
+            <w:pPr>
+              <w:jc w:val="right"/>
+            </w:pPr>
+            <w:r>
+              <w:rPr>
+                <w:rFonts w:ascii="Calibri" w:cs="Calibri" w:eastAsia="Calibri" w:hAnsi="Calibri"/>
+                <w:b w:val="false"/>
+                <w:bCs w:val="false"/>
+                <w:color w:val="1A1612"/>
+                <w:sz w:val="20"/>
+                <w:szCs w:val="20"/>
+              </w:rPr>
+              <w:t xml:space="preserve"/>
+            </w:r>
+          </w:p>
+        </w:tc>
+        <w:tc>
+          <w:tcPr>
+            <w:tcW w:type="dxa" w:w="1500"/>
+            <w:tcBorders>
+              <w:top w:val="single" w:color="EAE3D4" w:sz="6"/>
+              <w:left w:val="single" w:color="EAE3D4" w:sz="6"/>
+              <w:bottom w:val="single" w:color="EAE3D4" w:sz="6"/>
+              <w:right w:val="single" w:color="EAE3D4" w:sz="6"/>
+            </w:tcBorders>
+            <w:tcMar>
+              <w:top w:type="dxa" w:w="120"/>
+              <w:left w:type="dxa" w:w="160"/>
+              <w:bottom w:type="dxa" w:w="120"/>
+              <w:right w:type="dxa" w:w="160"/>
+            </w:tcMar>
+            <w:vAlign w:val="center"/>
+          </w:tcPr>
+          <w:p>
+            <w:pPr>
+              <w:jc w:val="right"/>
+            </w:pPr>
+            <w:r>
+              <w:rPr>
+                <w:rFonts w:ascii="Calibri" w:cs="Calibri" w:eastAsia="Calibri" w:hAnsi="Calibri"/>
+                <w:b w:val="false"/>
+                <w:bCs w:val="false"/>
+                <w:color w:val="1A1612"/>
+                <w:sz w:val="20"/>
+                <w:szCs w:val="20"/>
+              </w:rPr>
+              <w:t xml:space="preserve">380 T€</w:t>
+            </w:r>
+          </w:p>
+        </w:tc>
+      </w:tr>
+    </w:tbl>
+    <w:p>
+      <w:pPr>
+        <w:spacing w:after="200"/>
+      </w:pPr>
+      <w:r>
+        <w:t xml:space="preserve"/>
+      </w:r>
+    </w:p>
+    <w:p>
+      <w:pPr>
+        <w:pStyle w:val="Heading2"/>
+        <w:spacing w:after="160" w:before="320"/>
+      </w:pPr>
+      <w:r>
+        <w:rPr>
+          <w:rFonts w:ascii="Cambria" w:cs="Cambria" w:eastAsia="Cambria" w:hAnsi="Cambria"/>
+          <w:b/>
+          <w:bCs/>
+          <w:color w:val="1A1612"/>
+          <w:sz w:val="26"/>
+          <w:szCs w:val="26"/>
+        </w:rPr>
+        <w:t xml:space="preserve">Runway und nächste Finanzierungs-Runde</w:t>
+      </w:r>
+    </w:p>
+    <w:p>
+      <w:pPr>
+        <w:spacing w:after="120" w:line="300"/>
+        <w:jc w:val="both"/>
+      </w:pPr>
+      <w:r>
+        <w:rPr>
+          <w:rFonts w:ascii="Calibri" w:cs="Calibri" w:eastAsia="Calibri" w:hAnsi="Calibri"/>
+          <w:color w:val="1A1612"/>
+          <w:sz w:val="22"/>
+          <w:szCs w:val="22"/>
+        </w:rPr>
+        <w:t xml:space="preserve">Mit 1,0 Mio € und einer durchschnittlichen monatlichen Burn-Rate von 56 T€ (steigend von 38 T€ in Q2/2026 auf 78 T€ Ende 2027) beträgt die Laufzeit 18 Monate. Die nächste Finanzierungs-Runde (Seed, Zielvolumen 3–5 Mio €) ist für Q4/2027 geplant, sobald die drei Städte live sind und 1.500+ aktive Kunden existieren — das entspricht einer Annual Recurring Revenue von ~6 Mio €.</w:t>
+      </w:r>
+    </w:p>
+    <w:p>
+      <w:pPr>
+        <w:pStyle w:val="Heading2"/>
+        <w:spacing w:after="160" w:before="320"/>
+      </w:pPr>
+      <w:r>
+        <w:rPr>
+          <w:rFonts w:ascii="Cambria" w:cs="Cambria" w:eastAsia="Cambria" w:hAnsi="Cambria"/>
+          <w:b/>
+          <w:bCs/>
+          <w:color w:val="1A1612"/>
+          <w:sz w:val="26"/>
+          <w:szCs w:val="26"/>
+        </w:rPr>
+        <w:t xml:space="preserve">Worauf Investoren bei diesem Use-of-Funds achten sollten</w:t>
+      </w:r>
+    </w:p>
+    <w:p>
+      <w:pPr>
+        <w:spacing w:after="120" w:line="300"/>
+        <w:jc w:val="both"/>
+      </w:pPr>
+      <w:r>
+        <w:rPr>
+          <w:rFonts w:ascii="Calibri" w:cs="Calibri" w:eastAsia="Calibri" w:hAnsi="Calibri"/>
+          <w:color w:val="1A1612"/>
+          <w:sz w:val="22"/>
+          <w:szCs w:val="22"/>
+        </w:rPr>
+        <w:t xml:space="preserve">Die Struktur ist bewusst transparent aufgestellt: Gründer-Gehalt, Firmenwagen und Büro sind eigene, sichtbare Positionen — kein versteckter Kostenblock in einer Sammelkategorie. Das Gründer-Gehalt von 6.000 € brutto/Monat ist marktüblich für deutsche Pre-Seed-Solo-Founder (Bundesverband Deutsche Startups 2024: median 5.500–6.500 €) und hält den Founder operativ fokussiert statt durch Nebeneinkünfte abgelenkt. Der Firmenwagen ist kein Luxus, sondern operative Notwendigkeit für die geplante 3-Städte-Abdeckung (Frankfurt, Köln, Düsseldorf) bei Partnerterminen mit Sanitätshäusern, Apotheken und Krankenkassen. Recht/Notar/Versicherung enthält die anstehende Umwandlung UG → GmbH, die spätestens bei Seed-Runde Q4/2027 erforderlich wird.</w:t>
       </w:r>
     </w:p>
     <w:p>

</xml_diff>